<commit_message>
Correct over-stated metrics in shippable docs
- Policy brief: replace unreproducible '89.5% precision' (a phantom
  number matching no train/test/whole-dataset split) with the real
  model-card figures: per-case test ROC AUC 0.84, ~93% recall.
- how_to_do_this: the forecaster's raw LR scores are NOT well-calibrated
  (mean ~0.58 for a 0.75%-rate event); correct the calibration claim and
  note scores are a risk ranking, not literal probabilities.
- Research design: caveat the fairness 'pass' — only Christian (n=213)
  is reliably evaluable; Ahmadi (n=10) / Hindu (n=11) samples too small.
- Regenerated matching .pdf (pandoc/XeLaTeX) and .docx for all three.
</commit_message>
<xml_diff>
--- a/docs/01_policy_brief.docx
+++ b/docs/01_policy_brief.docx
@@ -68,6 +68,7 @@
       </w:r>
       <w:r>
         <w:rPr>
+          <w:iCs/>
           <w:i/>
         </w:rPr>
         <w:t xml:space="preserve">Before</w:t>
@@ -193,15 +194,14 @@
         <w:t xml:space="preserve">2026</w:t>
       </w:r>
     </w:p>
+    <w:bookmarkStart w:id="20" w:name="what-this-is-in-one-paragraph"/>
     <w:p>
       <w:pPr>
         <w:pStyle w:val="Heading2"/>
       </w:pPr>
-      <w:bookmarkStart w:id="20" w:name="what-this-is-in-one-paragraph"/>
       <w:r>
         <w:t xml:space="preserve">What this is, in one paragraph</w:t>
       </w:r>
-      <w:bookmarkEnd w:id="20"/>
     </w:p>
     <w:p>
       <w:pPr>
@@ -233,6 +233,7 @@
       </w:r>
       <w:r>
         <w:rPr>
+          <w:bCs/>
           <w:b/>
         </w:rPr>
         <w:t xml:space="preserve">about 4,100 such phone calls</w:t>
@@ -254,18 +255,21 @@
       </w:r>
       <w:r>
         <w:rPr>
+          <w:bCs/>
           <w:b/>
         </w:rPr>
         <w:t xml:space="preserve">reads</w:t>
       </w:r>
       <w:r>
         <w:rPr>
-          <w:b/>
-        </w:rPr>
-        <w:t xml:space="preserve"> </w:t>
-      </w:r>
-      <w:r>
-        <w:rPr>
+          <w:bCs/>
+          <w:b/>
+        </w:rPr>
+        <w:t xml:space="preserve"> </w:t>
+      </w:r>
+      <w:r>
+        <w:rPr>
+          <w:bCs/>
           <w:b/>
         </w:rPr>
         <w:t xml:space="preserve">those past phone calls and learns the pattern</w:t>
@@ -299,6 +303,7 @@
       </w:pPr>
       <w:r>
         <w:rPr>
+          <w:bCs/>
           <w:b/>
         </w:rPr>
         <w:t xml:space="preserve">Score every new phone call</w:t>
@@ -311,30 +316,35 @@
       </w:r>
       <w:r>
         <w:rPr>
+          <w:iCs/>
           <w:i/>
         </w:rPr>
         <w:t xml:space="preserve">“</w:t>
       </w:r>
       <w:r>
         <w:rPr>
+          <w:iCs/>
           <w:i/>
         </w:rPr>
         <w:t xml:space="preserve">this one looks</w:t>
       </w:r>
       <w:r>
         <w:rPr>
+          <w:iCs/>
           <w:i/>
         </w:rPr>
         <w:t xml:space="preserve"> </w:t>
       </w:r>
       <w:r>
         <w:rPr>
+          <w:iCs/>
           <w:i/>
         </w:rPr>
         <w:t xml:space="preserve">like a minority-targeted attack — pay extra attention</w:t>
       </w:r>
       <w:r>
         <w:rPr>
+          <w:iCs/>
           <w:i/>
         </w:rPr>
         <w:t xml:space="preserve">”</w:t>
@@ -353,6 +363,7 @@
       </w:pPr>
       <w:r>
         <w:rPr>
+          <w:bCs/>
           <w:b/>
         </w:rPr>
         <w:t xml:space="preserve">Look ahead at the next 30 days</w:t>
@@ -365,42 +376,49 @@
       </w:r>
       <w:r>
         <w:rPr>
+          <w:iCs/>
           <w:i/>
         </w:rPr>
         <w:t xml:space="preserve">“</w:t>
       </w:r>
       <w:r>
         <w:rPr>
+          <w:iCs/>
           <w:i/>
         </w:rPr>
         <w:t xml:space="preserve">this</w:t>
       </w:r>
       <w:r>
         <w:rPr>
+          <w:iCs/>
           <w:i/>
         </w:rPr>
         <w:t xml:space="preserve"> </w:t>
       </w:r>
       <w:r>
         <w:rPr>
+          <w:iCs/>
           <w:i/>
         </w:rPr>
         <w:t xml:space="preserve">particular police-station’s area is at higher risk — send a patrol</w:t>
       </w:r>
       <w:r>
         <w:rPr>
+          <w:iCs/>
           <w:i/>
         </w:rPr>
         <w:t xml:space="preserve"> </w:t>
       </w:r>
       <w:r>
         <w:rPr>
+          <w:iCs/>
           <w:i/>
         </w:rPr>
         <w:t xml:space="preserve">there even before any call comes in</w:t>
       </w:r>
       <w:r>
         <w:rPr>
+          <w:iCs/>
           <w:i/>
         </w:rPr>
         <w:t xml:space="preserve">”</w:t>
@@ -430,15 +448,15 @@
         </w:pict>
       </w:r>
     </w:p>
+    <w:bookmarkEnd w:id="20"/>
+    <w:bookmarkStart w:id="21" w:name="why-we-built-this"/>
     <w:p>
       <w:pPr>
         <w:pStyle w:val="Heading2"/>
       </w:pPr>
-      <w:bookmarkStart w:id="21" w:name="why-we-built-this"/>
       <w:r>
         <w:t xml:space="preserve">Why we built this</w:t>
       </w:r>
-      <w:bookmarkEnd w:id="21"/>
     </w:p>
     <w:p>
       <w:pPr>
@@ -452,6 +470,7 @@
       </w:r>
       <w:r>
         <w:rPr>
+          <w:bCs/>
           <w:b/>
         </w:rPr>
         <w:t xml:space="preserve">Emergency-15 helpline</w:t>
@@ -535,6 +554,7 @@
       </w:r>
       <w:r>
         <w:rPr>
+          <w:bCs/>
           <w:b/>
         </w:rPr>
         <w:t xml:space="preserve">don’t happen randomly</w:t>
@@ -553,6 +573,7 @@
       </w:pPr>
       <w:r>
         <w:rPr>
+          <w:bCs/>
           <w:b/>
         </w:rPr>
         <w:t xml:space="preserve">Around specific neighbourhoods</w:t>
@@ -574,6 +595,7 @@
       </w:r>
       <w:r>
         <w:rPr>
+          <w:iCs/>
           <w:i/>
         </w:rPr>
         <w:t xml:space="preserve">Mughalpura</w:t>
@@ -589,6 +611,7 @@
       </w:r>
       <w:r>
         <w:rPr>
+          <w:iCs/>
           <w:i/>
         </w:rPr>
         <w:t xml:space="preserve">Garhi Shahu</w:t>
@@ -610,6 +633,7 @@
       </w:r>
       <w:r>
         <w:rPr>
+          <w:iCs/>
           <w:i/>
         </w:rPr>
         <w:t xml:space="preserve">Dijkot</w:t>
@@ -625,6 +649,7 @@
       </w:r>
       <w:r>
         <w:rPr>
+          <w:iCs/>
           <w:i/>
         </w:rPr>
         <w:t xml:space="preserve">Moutra</w:t>
@@ -646,6 +671,7 @@
       </w:pPr>
       <w:r>
         <w:rPr>
+          <w:bCs/>
           <w:b/>
         </w:rPr>
         <w:t xml:space="preserve">Around specific dates</w:t>
@@ -673,6 +699,7 @@
       </w:pPr>
       <w:r>
         <w:rPr>
+          <w:bCs/>
           <w:b/>
         </w:rPr>
         <w:t xml:space="preserve">Around political events</w:t>
@@ -700,6 +727,7 @@
       </w:pPr>
       <w:r>
         <w:rPr>
+          <w:bCs/>
           <w:b/>
         </w:rPr>
         <w:t xml:space="preserve">After misinformation goes viral</w:t>
@@ -729,6 +757,7 @@
       </w:r>
       <w:r>
         <w:rPr>
+          <w:iCs/>
           <w:i/>
         </w:rPr>
         <w:t xml:space="preserve">detect</w:t>
@@ -744,6 +773,7 @@
       </w:r>
       <w:r>
         <w:rPr>
+          <w:bCs/>
           <w:b/>
         </w:rPr>
         <w:t xml:space="preserve">warn the police a few days early</w:t>
@@ -765,25 +795,24 @@
         </w:pict>
       </w:r>
     </w:p>
+    <w:bookmarkEnd w:id="21"/>
+    <w:bookmarkStart w:id="26" w:name="what-we-did-step-by-step"/>
     <w:p>
       <w:pPr>
         <w:pStyle w:val="Heading2"/>
       </w:pPr>
-      <w:bookmarkStart w:id="22" w:name="what-we-did-step-by-step"/>
       <w:r>
         <w:t xml:space="preserve">What we did, step by step</w:t>
       </w:r>
-      <w:bookmarkEnd w:id="22"/>
-    </w:p>
+    </w:p>
+    <w:bookmarkStart w:id="22" w:name="step-1-collected-the-data"/>
     <w:p>
       <w:pPr>
         <w:pStyle w:val="Heading3"/>
       </w:pPr>
-      <w:bookmarkStart w:id="23" w:name="step-1-collected-the-data"/>
       <w:r>
         <w:t xml:space="preserve">Step 1 — Collected the data</w:t>
       </w:r>
-      <w:bookmarkEnd w:id="23"/>
     </w:p>
     <w:p>
       <w:pPr>
@@ -797,6 +826,7 @@
       </w:r>
       <w:r>
         <w:rPr>
+          <w:bCs/>
           <w:b/>
         </w:rPr>
         <w:t xml:space="preserve">4,110 phone calls</w:t>
@@ -830,6 +860,7 @@
       </w:r>
       <w:r>
         <w:rPr>
+          <w:iCs/>
           <w:i/>
         </w:rPr>
         <w:t xml:space="preserve">Religious Offence</w:t>
@@ -869,6 +900,7 @@
       </w:r>
       <w:r>
         <w:rPr>
+          <w:iCs/>
           <w:i/>
         </w:rPr>
         <w:t xml:space="preserve">gurdwara</w:t>
@@ -881,6 +913,7 @@
       </w:r>
       <w:r>
         <w:rPr>
+          <w:iCs/>
           <w:i/>
         </w:rPr>
         <w:t xml:space="preserve">blasphemy</w:t>
@@ -901,6 +934,7 @@
       </w:r>
       <w:r>
         <w:rPr>
+          <w:bCs/>
           <w:b/>
         </w:rPr>
         <w:t xml:space="preserve">928 of these 4,110 calls came from Lahore alone</w:t>
@@ -918,15 +952,15 @@
         <w:t xml:space="preserve">why Lahore is the focus of this project.</w:t>
       </w:r>
     </w:p>
+    <w:bookmarkEnd w:id="22"/>
+    <w:bookmarkStart w:id="23" w:name="step-2-labelled-each-call"/>
     <w:p>
       <w:pPr>
         <w:pStyle w:val="Heading3"/>
       </w:pPr>
-      <w:bookmarkStart w:id="24" w:name="step-2-labelled-each-call"/>
       <w:r>
         <w:t xml:space="preserve">Step 2 — Labelled each call</w:t>
       </w:r>
-      <w:bookmarkEnd w:id="24"/>
     </w:p>
     <w:p>
       <w:pPr>
@@ -940,18 +974,21 @@
       </w:r>
       <w:r>
         <w:rPr>
+          <w:iCs/>
           <w:i/>
         </w:rPr>
         <w:t xml:space="preserve">was this incident clearly a</w:t>
       </w:r>
       <w:r>
         <w:rPr>
+          <w:iCs/>
           <w:i/>
         </w:rPr>
         <w:t xml:space="preserve"> </w:t>
       </w:r>
       <w:r>
         <w:rPr>
+          <w:iCs/>
           <w:i/>
         </w:rPr>
         <w:t xml:space="preserve">minority-targeted attack, or could it have been something else?</w:t>
@@ -985,18 +1022,21 @@
       </w:r>
       <w:r>
         <w:rPr>
+          <w:bCs/>
           <w:b/>
         </w:rPr>
         <w:t xml:space="preserve">“</w:t>
       </w:r>
       <w:r>
         <w:rPr>
+          <w:bCs/>
           <w:b/>
         </w:rPr>
         <w:t xml:space="preserve">strict-label minority-targeted</w:t>
       </w:r>
       <w:r>
         <w:rPr>
+          <w:bCs/>
           <w:b/>
         </w:rPr>
         <w:t xml:space="preserve">”</w:t>
@@ -1018,6 +1058,7 @@
       </w:r>
       <w:r>
         <w:rPr>
+          <w:bCs/>
           <w:b/>
         </w:rPr>
         <w:t xml:space="preserve">312 calls</w:t>
@@ -1029,15 +1070,15 @@
         <w:t xml:space="preserve">fall into this strict category.</w:t>
       </w:r>
     </w:p>
+    <w:bookmarkEnd w:id="23"/>
+    <w:bookmarkStart w:id="24" w:name="X704a911a1da8952305715ffdb641ff5ff043c21"/>
     <w:p>
       <w:pPr>
         <w:pStyle w:val="Heading3"/>
       </w:pPr>
-      <w:bookmarkStart w:id="25" w:name="X704a911a1da8952305715ffdb641ff5ff043c21"/>
       <w:r>
         <w:t xml:space="preserve">Step 3 — Built features (clues) the computer can use</w:t>
       </w:r>
-      <w:bookmarkEnd w:id="25"/>
     </w:p>
     <w:p>
       <w:pPr>
@@ -1057,6 +1098,7 @@
       </w:pPr>
       <w:r>
         <w:rPr>
+          <w:bCs/>
           <w:b/>
         </w:rPr>
         <w:t xml:space="preserve">History of nearby calls</w:t>
@@ -1090,6 +1132,7 @@
       </w:pPr>
       <w:r>
         <w:rPr>
+          <w:bCs/>
           <w:b/>
         </w:rPr>
         <w:t xml:space="preserve">Religious calendar</w:t>
@@ -1117,6 +1160,7 @@
       </w:pPr>
       <w:r>
         <w:rPr>
+          <w:bCs/>
           <w:b/>
         </w:rPr>
         <w:t xml:space="preserve">Political calendar</w:t>
@@ -1138,6 +1182,7 @@
       </w:pPr>
       <w:r>
         <w:rPr>
+          <w:bCs/>
           <w:b/>
         </w:rPr>
         <w:t xml:space="preserve">Misinformation events</w:t>
@@ -1165,6 +1210,7 @@
       </w:pPr>
       <w:r>
         <w:rPr>
+          <w:bCs/>
           <w:b/>
         </w:rPr>
         <w:t xml:space="preserve">Police response speed in that area</w:t>
@@ -1192,6 +1238,7 @@
       </w:pPr>
       <w:r>
         <w:rPr>
+          <w:bCs/>
           <w:b/>
         </w:rPr>
         <w:t xml:space="preserve">Social media sentiment</w:t>
@@ -1221,15 +1268,15 @@
         <w:t xml:space="preserve">available.)</w:t>
       </w:r>
     </w:p>
+    <w:bookmarkEnd w:id="24"/>
+    <w:bookmarkStart w:id="25" w:name="step-4-trained-three-computer-models"/>
     <w:p>
       <w:pPr>
         <w:pStyle w:val="Heading3"/>
       </w:pPr>
-      <w:bookmarkStart w:id="26" w:name="step-4-trained-three-computer-models"/>
       <w:r>
         <w:t xml:space="preserve">Step 4 — Trained three computer models</w:t>
       </w:r>
-      <w:bookmarkEnd w:id="26"/>
     </w:p>
     <w:p>
       <w:pPr>
@@ -1266,8 +1313,9 @@
     <w:tbl>
       <w:tblPr>
         <w:tblStyle w:val="Table"/>
-        <w:tblW w:type="pct" w:w="5000.0"/>
-        <w:tblLook w:firstRow="1"/>
+        <w:tblW w:type="pct" w:w="5000"/>
+        <w:tblLook w:firstRow="1" w:lastRow="0" w:firstColumn="0" w:lastColumn="0" w:noHBand="0" w:noVBand="0" w:val="0020"/>
+        <w:jc w:val="start"/>
       </w:tblPr>
       <w:tblGrid>
         <w:gridCol w:w="3960"/>
@@ -1275,15 +1323,10 @@
       </w:tblGrid>
       <w:tr>
         <w:trPr>
-          <w:cnfStyle w:firstRow="1"/>
+          <w:tblHeader w:val="true"/>
         </w:trPr>
         <w:tc>
-          <w:tcPr>
-            <w:tcBorders>
-              <w:bottom w:val="single"/>
-            </w:tcBorders>
-            <w:vAlign w:val="bottom"/>
-          </w:tcPr>
+          <w:tcPr/>
           <w:p>
             <w:pPr>
               <w:pStyle w:val="Compact"/>
@@ -1295,12 +1338,7 @@
           </w:p>
         </w:tc>
         <w:tc>
-          <w:tcPr>
-            <w:tcBorders>
-              <w:bottom w:val="single"/>
-            </w:tcBorders>
-            <w:vAlign w:val="bottom"/>
-          </w:tcPr>
+          <w:tcPr/>
           <w:p>
             <w:pPr>
               <w:pStyle w:val="Compact"/>
@@ -1314,6 +1352,7 @@
       </w:tr>
       <w:tr>
         <w:tc>
+          <w:tcPr/>
           <w:p>
             <w:pPr>
               <w:pStyle w:val="Compact"/>
@@ -1321,6 +1360,7 @@
             </w:pPr>
             <w:r>
               <w:rPr>
+                <w:bCs/>
                 <w:b/>
               </w:rPr>
               <w:t xml:space="preserve">Per-case classifier</w:t>
@@ -1328,6 +1368,7 @@
           </w:p>
         </w:tc>
         <w:tc>
+          <w:tcPr/>
           <w:p>
             <w:pPr>
               <w:pStyle w:val="Compact"/>
@@ -1335,18 +1376,21 @@
             </w:pPr>
             <w:r>
               <w:rPr>
+                <w:iCs/>
                 <w:i/>
               </w:rPr>
               <w:t xml:space="preserve">“</w:t>
             </w:r>
             <w:r>
               <w:rPr>
+                <w:iCs/>
                 <w:i/>
               </w:rPr>
               <w:t xml:space="preserve">This call just came in. Is it likely a minority-targeted attack?</w:t>
             </w:r>
             <w:r>
               <w:rPr>
+                <w:iCs/>
                 <w:i/>
               </w:rPr>
               <w:t xml:space="preserve">”</w:t>
@@ -1356,6 +1400,7 @@
       </w:tr>
       <w:tr>
         <w:tc>
+          <w:tcPr/>
           <w:p>
             <w:pPr>
               <w:pStyle w:val="Compact"/>
@@ -1363,6 +1408,7 @@
             </w:pPr>
             <w:r>
               <w:rPr>
+                <w:bCs/>
                 <w:b/>
               </w:rPr>
               <w:t xml:space="preserve">PS-week forecaster</w:t>
@@ -1370,6 +1416,7 @@
           </w:p>
         </w:tc>
         <w:tc>
+          <w:tcPr/>
           <w:p>
             <w:pPr>
               <w:pStyle w:val="Compact"/>
@@ -1377,18 +1424,21 @@
             </w:pPr>
             <w:r>
               <w:rPr>
+                <w:iCs/>
                 <w:i/>
               </w:rPr>
               <w:t xml:space="preserve">“</w:t>
             </w:r>
             <w:r>
               <w:rPr>
+                <w:iCs/>
                 <w:i/>
               </w:rPr>
               <w:t xml:space="preserve">For each police-station area, will an attack happen there in the next 30 days?</w:t>
             </w:r>
             <w:r>
               <w:rPr>
+                <w:iCs/>
                 <w:i/>
               </w:rPr>
               <w:t xml:space="preserve">”</w:t>
@@ -1404,6 +1454,7 @@
             </w:r>
             <w:r>
               <w:rPr>
+                <w:iCs/>
                 <w:i/>
               </w:rPr>
               <w:t xml:space="preserve">early warning</w:t>
@@ -1416,6 +1467,7 @@
       </w:tr>
       <w:tr>
         <w:tc>
+          <w:tcPr/>
           <w:p>
             <w:pPr>
               <w:pStyle w:val="Compact"/>
@@ -1423,6 +1475,7 @@
             </w:pPr>
             <w:r>
               <w:rPr>
+                <w:bCs/>
                 <w:b/>
               </w:rPr>
               <w:t xml:space="preserve">Volume forecaster (Prophet)</w:t>
@@ -1430,6 +1483,7 @@
           </w:p>
         </w:tc>
         <w:tc>
+          <w:tcPr/>
           <w:p>
             <w:pPr>
               <w:pStyle w:val="Compact"/>
@@ -1437,18 +1491,21 @@
             </w:pPr>
             <w:r>
               <w:rPr>
+                <w:iCs/>
                 <w:i/>
               </w:rPr>
               <w:t xml:space="preserve">“</w:t>
             </w:r>
             <w:r>
               <w:rPr>
+                <w:iCs/>
                 <w:i/>
               </w:rPr>
               <w:t xml:space="preserve">How many minority-related cases should we expect across Punjab next month?</w:t>
             </w:r>
             <w:r>
               <w:rPr>
+                <w:iCs/>
                 <w:i/>
               </w:rPr>
               <w:t xml:space="preserve">”</w:t>
@@ -1484,25 +1541,25 @@
         </w:pict>
       </w:r>
     </w:p>
+    <w:bookmarkEnd w:id="25"/>
+    <w:bookmarkEnd w:id="26"/>
+    <w:bookmarkStart w:id="31" w:name="what-the-system-found"/>
     <w:p>
       <w:pPr>
         <w:pStyle w:val="Heading2"/>
       </w:pPr>
-      <w:bookmarkStart w:id="27" w:name="what-the-system-found"/>
       <w:r>
         <w:t xml:space="preserve">What the system found</w:t>
       </w:r>
-      <w:bookmarkEnd w:id="27"/>
-    </w:p>
+    </w:p>
+    <w:bookmarkStart w:id="27" w:name="finding-1-the-model-works"/>
     <w:p>
       <w:pPr>
         <w:pStyle w:val="Heading3"/>
       </w:pPr>
-      <w:bookmarkStart w:id="28" w:name="finding-1-the-model-works"/>
       <w:r>
         <w:t xml:space="preserve">Finding 1 — The model works</w:t>
       </w:r>
-      <w:bookmarkEnd w:id="28"/>
     </w:p>
     <w:p>
       <w:pPr>
@@ -1521,76 +1578,95 @@
         <w:pStyle w:val="Compact"/>
       </w:pPr>
       <w:r>
-        <w:t xml:space="preserve">The per-case classifier correctly</w:t>
-      </w:r>
-      <w:r>
-        <w:t xml:space="preserve"> </w:t>
-      </w:r>
-      <w:r>
-        <w:rPr>
-          <w:b/>
-        </w:rPr>
-        <w:t xml:space="preserve">agrees with the official</w:t>
-      </w:r>
-      <w:r>
-        <w:rPr>
-          <w:b/>
-        </w:rPr>
-        <w:t xml:space="preserve"> </w:t>
-      </w:r>
-      <w:r>
-        <w:rPr>
-          <w:b/>
-        </w:rPr>
-        <w:t xml:space="preserve">“</w:t>
-      </w:r>
-      <w:r>
-        <w:rPr>
-          <w:b/>
-        </w:rPr>
-        <w:t xml:space="preserve">minority-</w:t>
-      </w:r>
-      <w:r>
-        <w:rPr>
-          <w:b/>
-        </w:rPr>
-        <w:t xml:space="preserve"> </w:t>
-      </w:r>
-      <w:r>
-        <w:rPr>
-          <w:b/>
-        </w:rPr>
-        <w:t xml:space="preserve">targeted</w:t>
-      </w:r>
-      <w:r>
-        <w:rPr>
-          <w:b/>
-        </w:rPr>
-        <w:t xml:space="preserve">”</w:t>
-      </w:r>
-      <w:r>
-        <w:rPr>
-          <w:b/>
-        </w:rPr>
-        <w:t xml:space="preserve"> </w:t>
-      </w:r>
-      <w:r>
-        <w:rPr>
-          <w:b/>
-        </w:rPr>
-        <w:t xml:space="preserve">label 89.5% of the time</w:t>
-      </w:r>
-      <w:r>
-        <w:t xml:space="preserve"> </w:t>
-      </w:r>
-      <w:r>
-        <w:t xml:space="preserve">when its confidence is above 50%</w:t>
-      </w:r>
-      <w:r>
-        <w:t xml:space="preserve"> </w:t>
-      </w:r>
-      <w:r>
-        <w:t xml:space="preserve">(its precision at threshold 0.5).</w:t>
+        <w:t xml:space="preserve">The per-case classifier ranks cases well on held-out 2026 test data</w:t>
+      </w:r>
+      <w:r>
+        <w:t xml:space="preserve"> </w:t>
+      </w:r>
+      <w:r>
+        <w:t xml:space="preserve">(</w:t>
+      </w:r>
+      <w:r>
+        <w:rPr>
+          <w:bCs/>
+          <w:b/>
+        </w:rPr>
+        <w:t xml:space="preserve">ROC AUC 0.84</w:t>
+      </w:r>
+      <w:r>
+        <w:t xml:space="preserve">) and</w:t>
+      </w:r>
+      <w:r>
+        <w:t xml:space="preserve"> </w:t>
+      </w:r>
+      <w:r>
+        <w:rPr>
+          <w:bCs/>
+          <w:b/>
+        </w:rPr>
+        <w:t xml:space="preserve">catches about 93% of the cases that were truly</w:t>
+      </w:r>
+      <w:r>
+        <w:rPr>
+          <w:bCs/>
+          <w:b/>
+        </w:rPr>
+        <w:t xml:space="preserve"> </w:t>
+      </w:r>
+      <w:r>
+        <w:rPr>
+          <w:bCs/>
+          <w:b/>
+        </w:rPr>
+        <w:t xml:space="preserve">minority-targeted</w:t>
+      </w:r>
+      <w:r>
+        <w:t xml:space="preserve"> </w:t>
+      </w:r>
+      <w:r>
+        <w:t xml:space="preserve">(recall). Because such cases are rare it casts a wide</w:t>
+      </w:r>
+      <w:r>
+        <w:t xml:space="preserve"> </w:t>
+      </w:r>
+      <w:r>
+        <w:t xml:space="preserve">net, so only a minority of everything it flags is targeted — about</w:t>
+      </w:r>
+      <w:r>
+        <w:t xml:space="preserve"> </w:t>
+      </w:r>
+      <w:r>
+        <w:rPr>
+          <w:bCs/>
+          <w:b/>
+        </w:rPr>
+        <w:t xml:space="preserve">1 in</w:t>
+      </w:r>
+      <w:r>
+        <w:rPr>
+          <w:bCs/>
+          <w:b/>
+        </w:rPr>
+        <w:t xml:space="preserve"> </w:t>
+      </w:r>
+      <w:r>
+        <w:rPr>
+          <w:bCs/>
+          <w:b/>
+        </w:rPr>
+        <w:t xml:space="preserve">5 of its top-ranked cases</w:t>
+      </w:r>
+      <w:r>
+        <w:t xml:space="preserve"> </w:t>
+      </w:r>
+      <w:r>
+        <w:t xml:space="preserve">(precision@20), several times the base rate.</w:t>
+      </w:r>
+      <w:r>
+        <w:t xml:space="preserve"> </w:t>
+      </w:r>
+      <w:r>
+        <w:t xml:space="preserve">It is a triage aid a human reviews, not an autonomous decider.</w:t>
       </w:r>
     </w:p>
     <w:p>
@@ -1615,18 +1691,21 @@
       </w:r>
       <w:r>
         <w:rPr>
+          <w:bCs/>
           <w:b/>
         </w:rPr>
         <w:t xml:space="preserve">about 18× more true high-risk areas</w:t>
       </w:r>
       <w:r>
         <w:rPr>
-          <w:b/>
-        </w:rPr>
-        <w:t xml:space="preserve"> </w:t>
-      </w:r>
-      <w:r>
-        <w:rPr>
+          <w:bCs/>
+          <w:b/>
+        </w:rPr>
+        <w:t xml:space="preserve"> </w:t>
+      </w:r>
+      <w:r>
+        <w:rPr>
+          <w:bCs/>
           <w:b/>
         </w:rPr>
         <w:t xml:space="preserve">than random guessing would</w:t>
@@ -1654,6 +1733,7 @@
       </w:r>
       <w:r>
         <w:rPr>
+          <w:bCs/>
           <w:b/>
         </w:rPr>
         <w:t xml:space="preserve">9.54% average error</w:t>
@@ -1665,15 +1745,15 @@
         <w:t xml:space="preserve">— the best precision of any of the three.</w:t>
       </w:r>
     </w:p>
+    <w:bookmarkEnd w:id="27"/>
+    <w:bookmarkStart w:id="28" w:name="X47835c946ed117d90629be785a25b8fbcf303ca"/>
     <w:p>
       <w:pPr>
         <w:pStyle w:val="Heading3"/>
       </w:pPr>
-      <w:bookmarkStart w:id="29" w:name="X47835c946ed117d90629be785a25b8fbcf303ca"/>
       <w:r>
         <w:t xml:space="preserve">Finding 2 — Religious dates really do drive incidents</w:t>
       </w:r>
-      <w:bookmarkEnd w:id="29"/>
     </w:p>
     <w:p>
       <w:pPr>
@@ -1681,6 +1761,7 @@
       </w:pPr>
       <w:r>
         <w:rPr>
+          <w:bCs/>
           <w:b/>
         </w:rPr>
         <w:t xml:space="preserve">1 in 5 minority-related incidents (18.9%)</w:t>
@@ -1702,6 +1783,7 @@
       </w:r>
       <w:r>
         <w:rPr>
+          <w:bCs/>
           <w:b/>
         </w:rPr>
         <w:t xml:space="preserve">December 25, 2025 (Christmas Day)</w:t>
@@ -1719,15 +1801,15 @@
         <w:t xml:space="preserve">Christian-targeted incidents the same day.</w:t>
       </w:r>
     </w:p>
+    <w:bookmarkEnd w:id="28"/>
+    <w:bookmarkStart w:id="29" w:name="X45a5d9870f8bdcc891e93df81c37cdd27ace35c"/>
     <w:p>
       <w:pPr>
         <w:pStyle w:val="Heading3"/>
       </w:pPr>
-      <w:bookmarkStart w:id="30" w:name="X45a5d9870f8bdcc891e93df81c37cdd27ace35c"/>
       <w:r>
         <w:t xml:space="preserve">Finding 3 — The same neighbourhoods keep appearing</w:t>
       </w:r>
-      <w:bookmarkEnd w:id="30"/>
     </w:p>
     <w:p>
       <w:pPr>
@@ -1740,21 +1822,21 @@
     <w:tbl>
       <w:tblPr>
         <w:tblStyle w:val="Table"/>
-        <w:tblW w:type="pct" w:w="0.0"/>
-        <w:tblLook w:firstRow="1"/>
+        <w:tblW w:type="pct" w:w="5000"/>
+        <w:tblLook w:firstRow="1" w:lastRow="0" w:firstColumn="0" w:lastColumn="0" w:noHBand="0" w:noVBand="0" w:val="0020"/>
+        <w:jc w:val="start"/>
       </w:tblPr>
-      <w:tblGrid/>
+      <w:tblGrid>
+        <w:gridCol w:w="2640"/>
+        <w:gridCol w:w="2640"/>
+        <w:gridCol w:w="2640"/>
+      </w:tblGrid>
       <w:tr>
         <w:trPr>
-          <w:cnfStyle w:firstRow="1"/>
+          <w:tblHeader w:val="true"/>
         </w:trPr>
         <w:tc>
-          <w:tcPr>
-            <w:tcBorders>
-              <w:bottom w:val="single"/>
-            </w:tcBorders>
-            <w:vAlign w:val="bottom"/>
-          </w:tcPr>
+          <w:tcPr/>
           <w:p>
             <w:pPr>
               <w:pStyle w:val="Compact"/>
@@ -1766,12 +1848,7 @@
           </w:p>
         </w:tc>
         <w:tc>
-          <w:tcPr>
-            <w:tcBorders>
-              <w:bottom w:val="single"/>
-            </w:tcBorders>
-            <w:vAlign w:val="bottom"/>
-          </w:tcPr>
+          <w:tcPr/>
           <w:p>
             <w:pPr>
               <w:pStyle w:val="Compact"/>
@@ -1783,12 +1860,7 @@
           </w:p>
         </w:tc>
         <w:tc>
-          <w:tcPr>
-            <w:tcBorders>
-              <w:bottom w:val="single"/>
-            </w:tcBorders>
-            <w:vAlign w:val="bottom"/>
-          </w:tcPr>
+          <w:tcPr/>
           <w:p>
             <w:pPr>
               <w:pStyle w:val="Compact"/>
@@ -1802,6 +1874,7 @@
       </w:tr>
       <w:tr>
         <w:tc>
+          <w:tcPr/>
           <w:p>
             <w:pPr>
               <w:pStyle w:val="Compact"/>
@@ -1813,6 +1886,7 @@
           </w:p>
         </w:tc>
         <w:tc>
+          <w:tcPr/>
           <w:p>
             <w:pPr>
               <w:pStyle w:val="Compact"/>
@@ -1824,6 +1898,7 @@
           </w:p>
         </w:tc>
         <w:tc>
+          <w:tcPr/>
           <w:p>
             <w:pPr>
               <w:pStyle w:val="Compact"/>
@@ -1837,6 +1912,7 @@
       </w:tr>
       <w:tr>
         <w:tc>
+          <w:tcPr/>
           <w:p>
             <w:pPr>
               <w:pStyle w:val="Compact"/>
@@ -1848,6 +1924,7 @@
           </w:p>
         </w:tc>
         <w:tc>
+          <w:tcPr/>
           <w:p>
             <w:pPr>
               <w:pStyle w:val="Compact"/>
@@ -1859,6 +1936,7 @@
           </w:p>
         </w:tc>
         <w:tc>
+          <w:tcPr/>
           <w:p>
             <w:pPr>
               <w:pStyle w:val="Compact"/>
@@ -1872,6 +1950,7 @@
       </w:tr>
       <w:tr>
         <w:tc>
+          <w:tcPr/>
           <w:p>
             <w:pPr>
               <w:pStyle w:val="Compact"/>
@@ -1883,6 +1962,7 @@
           </w:p>
         </w:tc>
         <w:tc>
+          <w:tcPr/>
           <w:p>
             <w:pPr>
               <w:pStyle w:val="Compact"/>
@@ -1894,6 +1974,7 @@
           </w:p>
         </w:tc>
         <w:tc>
+          <w:tcPr/>
           <w:p>
             <w:pPr>
               <w:pStyle w:val="Compact"/>
@@ -1907,6 +1988,7 @@
       </w:tr>
       <w:tr>
         <w:tc>
+          <w:tcPr/>
           <w:p>
             <w:pPr>
               <w:pStyle w:val="Compact"/>
@@ -1918,6 +2000,7 @@
           </w:p>
         </w:tc>
         <w:tc>
+          <w:tcPr/>
           <w:p>
             <w:pPr>
               <w:pStyle w:val="Compact"/>
@@ -1929,6 +2012,7 @@
           </w:p>
         </w:tc>
         <w:tc>
+          <w:tcPr/>
           <w:p>
             <w:pPr>
               <w:pStyle w:val="Compact"/>
@@ -1942,6 +2026,7 @@
       </w:tr>
       <w:tr>
         <w:tc>
+          <w:tcPr/>
           <w:p>
             <w:pPr>
               <w:pStyle w:val="Compact"/>
@@ -1953,6 +2038,7 @@
           </w:p>
         </w:tc>
         <w:tc>
+          <w:tcPr/>
           <w:p>
             <w:pPr>
               <w:pStyle w:val="Compact"/>
@@ -1964,6 +2050,7 @@
           </w:p>
         </w:tc>
         <w:tc>
+          <w:tcPr/>
           <w:p>
             <w:pPr>
               <w:pStyle w:val="Compact"/>
@@ -1977,6 +2064,7 @@
       </w:tr>
       <w:tr>
         <w:tc>
+          <w:tcPr/>
           <w:p>
             <w:pPr>
               <w:pStyle w:val="Compact"/>
@@ -1988,6 +2076,7 @@
           </w:p>
         </w:tc>
         <w:tc>
+          <w:tcPr/>
           <w:p>
             <w:pPr>
               <w:pStyle w:val="Compact"/>
@@ -1999,6 +2088,7 @@
           </w:p>
         </w:tc>
         <w:tc>
+          <w:tcPr/>
           <w:p>
             <w:pPr>
               <w:pStyle w:val="Compact"/>
@@ -2011,15 +2101,15 @@
         </w:tc>
       </w:tr>
     </w:tbl>
+    <w:bookmarkEnd w:id="29"/>
+    <w:bookmarkStart w:id="30" w:name="finding-4-top-driving-signals"/>
     <w:p>
       <w:pPr>
         <w:pStyle w:val="Heading3"/>
       </w:pPr>
-      <w:bookmarkStart w:id="31" w:name="finding-4-top-driving-signals"/>
       <w:r>
         <w:t xml:space="preserve">Finding 4 — Top driving signals</w:t>
       </w:r>
-      <w:bookmarkEnd w:id="31"/>
     </w:p>
     <w:p>
       <w:pPr>
@@ -2033,18 +2123,21 @@
       </w:r>
       <w:r>
         <w:rPr>
+          <w:iCs/>
           <w:i/>
         </w:rPr>
         <w:t xml:space="preserve">“</w:t>
       </w:r>
       <w:r>
         <w:rPr>
+          <w:iCs/>
           <w:i/>
         </w:rPr>
         <w:t xml:space="preserve">which clues were most important?</w:t>
       </w:r>
       <w:r>
         <w:rPr>
+          <w:iCs/>
           <w:i/>
         </w:rPr>
         <w:t xml:space="preserve">”</w:t>
@@ -2138,15 +2231,16 @@
         </w:pict>
       </w:r>
     </w:p>
+    <w:bookmarkEnd w:id="30"/>
+    <w:bookmarkEnd w:id="31"/>
+    <w:bookmarkStart w:id="32" w:name="what-we-recommend"/>
     <w:p>
       <w:pPr>
         <w:pStyle w:val="Heading2"/>
       </w:pPr>
-      <w:bookmarkStart w:id="32" w:name="what-we-recommend"/>
       <w:r>
         <w:t xml:space="preserve">What we recommend</w:t>
       </w:r>
-      <w:bookmarkEnd w:id="32"/>
     </w:p>
     <w:p>
       <w:pPr>
@@ -2160,6 +2254,7 @@
       </w:r>
       <w:r>
         <w:rPr>
+          <w:bCs/>
           <w:b/>
         </w:rPr>
         <w:t xml:space="preserve">Punjab Safe Cities Authority (PSCA)</w:t>
@@ -2178,6 +2273,7 @@
       </w:pPr>
       <w:r>
         <w:rPr>
+          <w:bCs/>
           <w:b/>
         </w:rPr>
         <w:t xml:space="preserve">Use the system weekly.</w:t>
@@ -2211,6 +2307,7 @@
       </w:pPr>
       <w:r>
         <w:rPr>
+          <w:bCs/>
           <w:b/>
         </w:rPr>
         <w:t xml:space="preserve">Pre-position force for known calendar dates.</w:t>
@@ -2268,6 +2365,7 @@
       </w:pPr>
       <w:r>
         <w:rPr>
+          <w:bCs/>
           <w:b/>
         </w:rPr>
         <w:t xml:space="preserve">Track the model’s predictions over time.</w:t>
@@ -2303,6 +2401,7 @@
       </w:r>
       <w:r>
         <w:rPr>
+          <w:bCs/>
           <w:b/>
         </w:rPr>
         <w:t xml:space="preserve">the Information and Media authorities</w:t>
@@ -2321,18 +2420,21 @@
       </w:pPr>
       <w:r>
         <w:rPr>
+          <w:bCs/>
           <w:b/>
         </w:rPr>
         <w:t xml:space="preserve">Treat viral misinformation about minorities as a measurable</w:t>
       </w:r>
       <w:r>
         <w:rPr>
-          <w:b/>
-        </w:rPr>
-        <w:t xml:space="preserve"> </w:t>
-      </w:r>
-      <w:r>
-        <w:rPr>
+          <w:bCs/>
+          <w:b/>
+        </w:rPr>
+        <w:t xml:space="preserve"> </w:t>
+      </w:r>
+      <w:r>
+        <w:rPr>
+          <w:bCs/>
           <w:b/>
         </w:rPr>
         <w:t xml:space="preserve">predictor.</w:t>
@@ -2374,6 +2476,7 @@
       </w:r>
       <w:r>
         <w:rPr>
+          <w:bCs/>
           <w:b/>
         </w:rPr>
         <w:t xml:space="preserve">PSCA’s Virtual Center for Minorities (VCM)</w:t>
@@ -2392,6 +2495,7 @@
       </w:pPr>
       <w:r>
         <w:rPr>
+          <w:bCs/>
           <w:b/>
         </w:rPr>
         <w:t xml:space="preserve">Keep recording the free-text descriptions of every call.</w:t>
@@ -2431,6 +2535,7 @@
       </w:pPr>
       <w:r>
         <w:rPr>
+          <w:bCs/>
           <w:b/>
         </w:rPr>
         <w:t xml:space="preserve">Establish a monthly data-sharing handshake</w:t>
@@ -2466,6 +2571,7 @@
       </w:r>
       <w:r>
         <w:rPr>
+          <w:bCs/>
           <w:b/>
         </w:rPr>
         <w:t xml:space="preserve">minority community organizations</w:t>
@@ -2484,6 +2590,7 @@
       </w:pPr>
       <w:r>
         <w:rPr>
+          <w:bCs/>
           <w:b/>
         </w:rPr>
         <w:t xml:space="preserve">Engage with how the model is built and reviewed.</w:t>
@@ -2505,6 +2612,7 @@
       </w:r>
       <w:r>
         <w:rPr>
+          <w:iCs/>
           <w:i/>
         </w:rPr>
         <w:t xml:space="preserve">protect</w:t>
@@ -2535,15 +2643,15 @@
         </w:pict>
       </w:r>
     </w:p>
+    <w:bookmarkEnd w:id="32"/>
+    <w:bookmarkStart w:id="33" w:name="X59e4b19e471d962830528f8b4d38654342d6e68"/>
     <w:p>
       <w:pPr>
         <w:pStyle w:val="Heading2"/>
       </w:pPr>
-      <w:bookmarkStart w:id="33" w:name="X59e4b19e471d962830528f8b4d38654342d6e68"/>
       <w:r>
         <w:t xml:space="preserve">What we need to be honest about (limitations)</w:t>
       </w:r>
-      <w:bookmarkEnd w:id="33"/>
     </w:p>
     <w:p>
       <w:pPr>
@@ -2563,44 +2671,53 @@
       </w:pPr>
       <w:r>
         <w:rPr>
+          <w:bCs/>
           <w:b/>
         </w:rPr>
         <w:t xml:space="preserve">It predicts</w:t>
       </w:r>
       <w:r>
         <w:rPr>
-          <w:b/>
-        </w:rPr>
-        <w:t xml:space="preserve"> </w:t>
-      </w:r>
-      <w:r>
-        <w:rPr>
+          <w:bCs/>
+          <w:b/>
+        </w:rPr>
+        <w:t xml:space="preserve"> </w:t>
+      </w:r>
+      <w:r>
+        <w:rPr>
+          <w:iCs/>
           <w:i/>
+          <w:bCs/>
           <w:b/>
         </w:rPr>
         <w:t xml:space="preserve">reports</w:t>
       </w:r>
       <w:r>
         <w:rPr>
+          <w:bCs/>
           <w:b/>
         </w:rPr>
         <w:t xml:space="preserve">, not</w:t>
       </w:r>
       <w:r>
         <w:rPr>
-          <w:b/>
-        </w:rPr>
-        <w:t xml:space="preserve"> </w:t>
-      </w:r>
-      <w:r>
-        <w:rPr>
+          <w:bCs/>
+          <w:b/>
+        </w:rPr>
+        <w:t xml:space="preserve"> </w:t>
+      </w:r>
+      <w:r>
+        <w:rPr>
+          <w:iCs/>
           <w:i/>
+          <w:bCs/>
           <w:b/>
         </w:rPr>
         <w:t xml:space="preserve">incidents</w:t>
       </w:r>
       <w:r>
         <w:rPr>
+          <w:bCs/>
           <w:b/>
         </w:rPr>
         <w:t xml:space="preserve">.</w:t>
@@ -2628,120 +2745,140 @@
       </w:r>
       <w:r>
         <w:rPr>
+          <w:bCs/>
           <w:b/>
         </w:rPr>
         <w:t xml:space="preserve">A</w:t>
       </w:r>
       <w:r>
         <w:rPr>
-          <w:b/>
-        </w:rPr>
-        <w:t xml:space="preserve"> </w:t>
-      </w:r>
-      <w:r>
-        <w:rPr>
+          <w:bCs/>
+          <w:b/>
+        </w:rPr>
+        <w:t xml:space="preserve"> </w:t>
+      </w:r>
+      <w:r>
+        <w:rPr>
+          <w:bCs/>
           <w:b/>
         </w:rPr>
         <w:t xml:space="preserve">“</w:t>
       </w:r>
       <w:r>
         <w:rPr>
+          <w:bCs/>
           <w:b/>
         </w:rPr>
         <w:t xml:space="preserve">low risk</w:t>
       </w:r>
       <w:r>
         <w:rPr>
-          <w:b/>
-        </w:rPr>
-        <w:t xml:space="preserve"> </w:t>
-      </w:r>
-      <w:r>
-        <w:rPr>
+          <w:bCs/>
+          <w:b/>
+        </w:rPr>
+        <w:t xml:space="preserve"> </w:t>
+      </w:r>
+      <w:r>
+        <w:rPr>
+          <w:bCs/>
           <w:b/>
         </w:rPr>
         <w:t xml:space="preserve">score</w:t>
       </w:r>
       <w:r>
         <w:rPr>
+          <w:bCs/>
           <w:b/>
         </w:rPr>
         <w:t xml:space="preserve">”</w:t>
       </w:r>
       <w:r>
         <w:rPr>
-          <w:b/>
-        </w:rPr>
-        <w:t xml:space="preserve"> </w:t>
-      </w:r>
-      <w:r>
-        <w:rPr>
+          <w:bCs/>
+          <w:b/>
+        </w:rPr>
+        <w:t xml:space="preserve"> </w:t>
+      </w:r>
+      <w:r>
+        <w:rPr>
+          <w:bCs/>
           <w:b/>
         </w:rPr>
         <w:t xml:space="preserve">does NOT mean</w:t>
       </w:r>
       <w:r>
         <w:rPr>
-          <w:b/>
-        </w:rPr>
-        <w:t xml:space="preserve"> </w:t>
-      </w:r>
-      <w:r>
-        <w:rPr>
+          <w:bCs/>
+          <w:b/>
+        </w:rPr>
+        <w:t xml:space="preserve"> </w:t>
+      </w:r>
+      <w:r>
+        <w:rPr>
+          <w:bCs/>
           <w:b/>
         </w:rPr>
         <w:t xml:space="preserve">“</w:t>
       </w:r>
       <w:r>
         <w:rPr>
+          <w:bCs/>
           <w:b/>
         </w:rPr>
         <w:t xml:space="preserve">low actual risk</w:t>
       </w:r>
       <w:r>
         <w:rPr>
+          <w:bCs/>
           <w:b/>
         </w:rPr>
         <w:t xml:space="preserve">”</w:t>
       </w:r>
       <w:r>
         <w:rPr>
-          <w:b/>
-        </w:rPr>
-        <w:t xml:space="preserve"> </w:t>
-      </w:r>
-      <w:r>
-        <w:rPr>
+          <w:bCs/>
+          <w:b/>
+        </w:rPr>
+        <w:t xml:space="preserve"> </w:t>
+      </w:r>
+      <w:r>
+        <w:rPr>
+          <w:bCs/>
           <w:b/>
         </w:rPr>
         <w:t xml:space="preserve">— it means</w:t>
       </w:r>
       <w:r>
         <w:rPr>
-          <w:b/>
-        </w:rPr>
-        <w:t xml:space="preserve"> </w:t>
-      </w:r>
-      <w:r>
-        <w:rPr>
+          <w:bCs/>
+          <w:b/>
+        </w:rPr>
+        <w:t xml:space="preserve"> </w:t>
+      </w:r>
+      <w:r>
+        <w:rPr>
+          <w:bCs/>
           <w:b/>
         </w:rPr>
         <w:t xml:space="preserve">“</w:t>
       </w:r>
       <w:r>
         <w:rPr>
+          <w:bCs/>
           <w:b/>
         </w:rPr>
         <w:t xml:space="preserve">low reported risk</w:t>
       </w:r>
       <w:r>
         <w:rPr>
+          <w:bCs/>
           <w:b/>
         </w:rPr>
         <w:t xml:space="preserve">”</w:t>
       </w:r>
       <w:r>
         <w:rPr>
+          <w:bCs/>
           <w:b/>
         </w:rPr>
         <w:t xml:space="preserve">.</w:t>
@@ -2757,6 +2894,7 @@
       </w:pPr>
       <w:r>
         <w:rPr>
+          <w:bCs/>
           <w:b/>
         </w:rPr>
         <w:t xml:space="preserve">It is Lahore-heavy.</w:t>
@@ -2796,6 +2934,7 @@
       </w:pPr>
       <w:r>
         <w:rPr>
+          <w:bCs/>
           <w:b/>
         </w:rPr>
         <w:t xml:space="preserve">It is a triage and planning tool — not evidence.</w:t>
@@ -2817,6 +2956,7 @@
       </w:r>
       <w:r>
         <w:rPr>
+          <w:iCs/>
           <w:i/>
         </w:rPr>
         <w:t xml:space="preserve">hypothesis</w:t>
@@ -2847,6 +2987,7 @@
       </w:pPr>
       <w:r>
         <w:rPr>
+          <w:bCs/>
           <w:b/>
         </w:rPr>
         <w:t xml:space="preserve">It must never be used against minorities.</w:t>
@@ -2868,6 +3009,7 @@
       </w:r>
       <w:r>
         <w:rPr>
+          <w:iCs/>
           <w:i/>
         </w:rPr>
         <w:t xml:space="preserve">protect</w:t>
@@ -2898,15 +3040,15 @@
         </w:pict>
       </w:r>
     </w:p>
+    <w:bookmarkEnd w:id="33"/>
+    <w:bookmarkStart w:id="34" w:name="next-steps"/>
     <w:p>
       <w:pPr>
         <w:pStyle w:val="Heading2"/>
       </w:pPr>
-      <w:bookmarkStart w:id="34" w:name="next-steps"/>
       <w:r>
         <w:t xml:space="preserve">Next steps</w:t>
       </w:r>
-      <w:bookmarkEnd w:id="34"/>
     </w:p>
     <w:p>
       <w:pPr>
@@ -2918,6 +3060,7 @@
       </w:pPr>
       <w:r>
         <w:rPr>
+          <w:bCs/>
           <w:b/>
         </w:rPr>
         <w:t xml:space="preserve">Pilot for one quarter</w:t>
@@ -2951,6 +3094,7 @@
       </w:pPr>
       <w:r>
         <w:rPr>
+          <w:bCs/>
           <w:b/>
         </w:rPr>
         <w:t xml:space="preserve">Quarterly review</w:t>
@@ -2984,6 +3128,7 @@
       </w:pPr>
       <w:r>
         <w:rPr>
+          <w:bCs/>
           <w:b/>
         </w:rPr>
         <w:t xml:space="preserve">Open-source the methodology</w:t>
@@ -3011,6 +3156,7 @@
       </w:pPr>
       <w:r>
         <w:rPr>
+          <w:bCs/>
           <w:b/>
         </w:rPr>
         <w:t xml:space="preserve">Connect a social-media monitoring feed</w:t>
@@ -3035,15 +3181,15 @@
         </w:pict>
       </w:r>
     </w:p>
+    <w:bookmarkEnd w:id="34"/>
+    <w:bookmarkStart w:id="35" w:name="a-note-for-the-reader-who-isnt-technical"/>
     <w:p>
       <w:pPr>
         <w:pStyle w:val="Heading2"/>
       </w:pPr>
-      <w:bookmarkStart w:id="35" w:name="a-note-for-the-reader-who-isnt-technical"/>
       <w:r>
         <w:t xml:space="preserve">A note for the reader who isn’t technical</w:t>
       </w:r>
-      <w:bookmarkEnd w:id="35"/>
     </w:p>
     <w:p>
       <w:pPr>
@@ -3131,30 +3277,35 @@
       </w:r>
       <w:r>
         <w:rPr>
+          <w:iCs/>
           <w:i/>
         </w:rPr>
         <w:t xml:space="preserve">“</w:t>
       </w:r>
       <w:r>
         <w:rPr>
+          <w:iCs/>
           <w:i/>
         </w:rPr>
         <w:t xml:space="preserve">there’s going to be</w:t>
       </w:r>
       <w:r>
         <w:rPr>
+          <w:iCs/>
           <w:i/>
         </w:rPr>
         <w:t xml:space="preserve"> </w:t>
       </w:r>
       <w:r>
         <w:rPr>
+          <w:iCs/>
           <w:i/>
         </w:rPr>
         <w:t xml:space="preserve">trouble in this area next month.</w:t>
       </w:r>
       <w:r>
         <w:rPr>
+          <w:iCs/>
           <w:i/>
         </w:rPr>
         <w:t xml:space="preserve">”</w:t>
@@ -3198,6 +3349,7 @@
       </w:r>
       <w:r>
         <w:rPr>
+          <w:iCs/>
           <w:i/>
         </w:rPr>
         <w:t xml:space="preserve">replace</w:t>
@@ -3234,6 +3386,7 @@
       </w:pPr>
       <w:r>
         <w:rPr>
+          <w:iCs/>
           <w:i/>
         </w:rPr>
         <w:t xml:space="preserve">Authors: Internship project, Minorities Early-Warning System.</w:t>
@@ -3243,6 +3396,7 @@
       </w:r>
       <w:r>
         <w:rPr>
+          <w:iCs/>
           <w:i/>
         </w:rPr>
         <w:t xml:space="preserve">Last updated: June 2026.</w:t>
@@ -3252,23 +3406,27 @@
       </w:r>
       <w:r>
         <w:rPr>
+          <w:iCs/>
           <w:i/>
         </w:rPr>
         <w:t xml:space="preserve">For the underlying methodology, see the detailed report and the</w:t>
       </w:r>
       <w:r>
         <w:rPr>
+          <w:iCs/>
           <w:i/>
         </w:rPr>
         <w:t xml:space="preserve"> </w:t>
       </w:r>
       <w:r>
         <w:rPr>
+          <w:iCs/>
           <w:i/>
         </w:rPr>
         <w:t xml:space="preserve">model cards in the full project archive.</w:t>
       </w:r>
     </w:p>
+    <w:bookmarkEnd w:id="35"/>
     <w:sectPr/>
   </w:body>
 </w:document>
@@ -3300,17 +3458,14 @@
 <file path=word/numbering.xml><?xml version="1.0" encoding="utf-8"?>
 <w:numbering xmlns:w="http://schemas.openxmlformats.org/wordprocessingml/2006/main">
   <w:abstractNum w:abstractNumId="990">
-    <w:nsid w:val="2c1ae401"/>
+    <w:nsid w:val="A990"/>
     <w:multiLevelType w:val="multilevel"/>
     <w:lvl w:ilvl="0">
       <w:numFmt w:val="bullet"/>
       <w:lvlText w:val=" "/>
       <w:lvlJc w:val="left"/>
       <w:pPr>
-        <w:tabs>
-          <w:tab w:val="num" w:pos="0"/>
-        </w:tabs>
-        <w:ind w:left="480" w:hanging="480"/>
+        <w:ind w:left="720" w:hanging="480"/>
       </w:pPr>
     </w:lvl>
     <w:lvl w:ilvl="1">
@@ -3318,10 +3473,7 @@
       <w:lvlText w:val=" "/>
       <w:lvlJc w:val="left"/>
       <w:pPr>
-        <w:tabs>
-          <w:tab w:val="num" w:pos="720"/>
-        </w:tabs>
-        <w:ind w:left="1200" w:hanging="480"/>
+        <w:ind w:left="1440" w:hanging="480"/>
       </w:pPr>
     </w:lvl>
     <w:lvl w:ilvl="2">
@@ -3329,10 +3481,7 @@
       <w:lvlText w:val=" "/>
       <w:lvlJc w:val="left"/>
       <w:pPr>
-        <w:tabs>
-          <w:tab w:val="num" w:pos="1440"/>
-        </w:tabs>
-        <w:ind w:left="1920" w:hanging="480"/>
+        <w:ind w:left="2160" w:hanging="480"/>
       </w:pPr>
     </w:lvl>
     <w:lvl w:ilvl="3">
@@ -3340,10 +3489,7 @@
       <w:lvlText w:val=" "/>
       <w:lvlJc w:val="left"/>
       <w:pPr>
-        <w:tabs>
-          <w:tab w:val="num" w:pos="2160"/>
-        </w:tabs>
-        <w:ind w:left="2640" w:hanging="480"/>
+        <w:ind w:left="2880" w:hanging="480"/>
       </w:pPr>
     </w:lvl>
     <w:lvl w:ilvl="4">
@@ -3351,10 +3497,7 @@
       <w:lvlText w:val=" "/>
       <w:lvlJc w:val="left"/>
       <w:pPr>
-        <w:tabs>
-          <w:tab w:val="num" w:pos="2880"/>
-        </w:tabs>
-        <w:ind w:left="3360" w:hanging="480"/>
+        <w:ind w:left="3600" w:hanging="480"/>
       </w:pPr>
     </w:lvl>
     <w:lvl w:ilvl="5">
@@ -3362,10 +3505,7 @@
       <w:lvlText w:val=" "/>
       <w:lvlJc w:val="left"/>
       <w:pPr>
-        <w:tabs>
-          <w:tab w:val="num" w:pos="3600"/>
-        </w:tabs>
-        <w:ind w:left="4080" w:hanging="480"/>
+        <w:ind w:left="4320" w:hanging="480"/>
       </w:pPr>
     </w:lvl>
     <w:lvl w:ilvl="6">
@@ -3373,10 +3513,7 @@
       <w:lvlText w:val=" "/>
       <w:lvlJc w:val="left"/>
       <w:pPr>
-        <w:tabs>
-          <w:tab w:val="num" w:pos="4320"/>
-        </w:tabs>
-        <w:ind w:left="4800" w:hanging="480"/>
+        <w:ind w:left="5040" w:hanging="480"/>
       </w:pPr>
     </w:lvl>
     <w:lvl w:ilvl="7">
@@ -3384,10 +3521,7 @@
       <w:lvlText w:val=" "/>
       <w:lvlJc w:val="left"/>
       <w:pPr>
-        <w:tabs>
-          <w:tab w:val="num" w:pos="5040"/>
-        </w:tabs>
-        <w:ind w:left="5520" w:hanging="480"/>
+        <w:ind w:left="5760" w:hanging="480"/>
       </w:pPr>
     </w:lvl>
     <w:lvl w:ilvl="8">
@@ -3395,15 +3529,12 @@
       <w:lvlText w:val=" "/>
       <w:lvlJc w:val="left"/>
       <w:pPr>
-        <w:tabs>
-          <w:tab w:val="num" w:pos="5760"/>
-        </w:tabs>
-        <w:ind w:left="6240" w:hanging="480"/>
+        <w:ind w:left="6480" w:hanging="480"/>
       </w:pPr>
     </w:lvl>
   </w:abstractNum>
   <w:abstractNum w:abstractNumId="99411">
-    <w:nsid w:val="ea454b4c"/>
+    <w:nsid w:val="A99411"/>
     <w:multiLevelType w:val="multilevel"/>
     <w:lvl w:ilvl="0">
       <w:start w:val="1"/>
@@ -3411,10 +3542,7 @@
       <w:lvlText w:val="%1."/>
       <w:lvlJc w:val="left"/>
       <w:pPr>
-        <w:tabs>
-          <w:tab w:val="num" w:pos="0"/>
-        </w:tabs>
-        <w:ind w:left="480" w:hanging="480"/>
+        <w:ind w:left="720" w:hanging="480"/>
       </w:pPr>
     </w:lvl>
     <w:lvl w:ilvl="1">
@@ -3423,10 +3551,7 @@
       <w:lvlText w:val="%2."/>
       <w:lvlJc w:val="left"/>
       <w:pPr>
-        <w:tabs>
-          <w:tab w:val="num" w:pos="720"/>
-        </w:tabs>
-        <w:ind w:left="1200" w:hanging="480"/>
+        <w:ind w:left="1440" w:hanging="480"/>
       </w:pPr>
     </w:lvl>
     <w:lvl w:ilvl="2">
@@ -3435,10 +3560,7 @@
       <w:lvlText w:val="%3."/>
       <w:lvlJc w:val="left"/>
       <w:pPr>
-        <w:tabs>
-          <w:tab w:val="num" w:pos="1440"/>
-        </w:tabs>
-        <w:ind w:left="1920" w:hanging="480"/>
+        <w:ind w:left="2160" w:hanging="480"/>
       </w:pPr>
     </w:lvl>
     <w:lvl w:ilvl="3">
@@ -3447,10 +3569,7 @@
       <w:lvlText w:val="%4."/>
       <w:lvlJc w:val="left"/>
       <w:pPr>
-        <w:tabs>
-          <w:tab w:val="num" w:pos="2160"/>
-        </w:tabs>
-        <w:ind w:left="2640" w:hanging="480"/>
+        <w:ind w:left="2880" w:hanging="480"/>
       </w:pPr>
     </w:lvl>
     <w:lvl w:ilvl="4">
@@ -3459,10 +3578,7 @@
       <w:lvlText w:val="%5."/>
       <w:lvlJc w:val="left"/>
       <w:pPr>
-        <w:tabs>
-          <w:tab w:val="num" w:pos="2880"/>
-        </w:tabs>
-        <w:ind w:left="3360" w:hanging="480"/>
+        <w:ind w:left="3600" w:hanging="480"/>
       </w:pPr>
     </w:lvl>
     <w:lvl w:ilvl="5">
@@ -3471,10 +3587,7 @@
       <w:lvlText w:val="%6."/>
       <w:lvlJc w:val="left"/>
       <w:pPr>
-        <w:tabs>
-          <w:tab w:val="num" w:pos="3600"/>
-        </w:tabs>
-        <w:ind w:left="4080" w:hanging="480"/>
+        <w:ind w:left="4320" w:hanging="480"/>
       </w:pPr>
     </w:lvl>
     <w:lvl w:ilvl="6">
@@ -3483,10 +3596,7 @@
       <w:lvlText w:val="%7."/>
       <w:lvlJc w:val="left"/>
       <w:pPr>
-        <w:tabs>
-          <w:tab w:val="num" w:pos="4320"/>
-        </w:tabs>
-        <w:ind w:left="4800" w:hanging="480"/>
+        <w:ind w:left="5040" w:hanging="480"/>
       </w:pPr>
     </w:lvl>
     <w:lvl w:ilvl="7">
@@ -3495,10 +3605,7 @@
       <w:lvlText w:val="%8."/>
       <w:lvlJc w:val="left"/>
       <w:pPr>
-        <w:tabs>
-          <w:tab w:val="num" w:pos="5040"/>
-        </w:tabs>
-        <w:ind w:left="5520" w:hanging="480"/>
+        <w:ind w:left="5760" w:hanging="480"/>
       </w:pPr>
     </w:lvl>
     <w:lvl w:ilvl="8">
@@ -3507,25 +3614,19 @@
       <w:lvlText w:val="%9."/>
       <w:lvlJc w:val="left"/>
       <w:pPr>
-        <w:tabs>
-          <w:tab w:val="num" w:pos="5760"/>
-        </w:tabs>
-        <w:ind w:left="6240" w:hanging="480"/>
+        <w:ind w:left="6480" w:hanging="480"/>
       </w:pPr>
     </w:lvl>
   </w:abstractNum>
   <w:abstractNum w:abstractNumId="991">
-    <w:nsid w:val="71315dca"/>
+    <w:nsid w:val="A991"/>
     <w:multiLevelType w:val="multilevel"/>
     <w:lvl w:ilvl="0">
       <w:numFmt w:val="bullet"/>
       <w:lvlText w:val="•"/>
       <w:lvlJc w:val="left"/>
       <w:pPr>
-        <w:tabs>
-          <w:tab w:val="num" w:pos="0"/>
-        </w:tabs>
-        <w:ind w:left="480" w:hanging="480"/>
+        <w:ind w:left="720" w:hanging="480"/>
       </w:pPr>
     </w:lvl>
     <w:lvl w:ilvl="1">
@@ -3533,10 +3634,7 @@
       <w:lvlText w:val="–"/>
       <w:lvlJc w:val="left"/>
       <w:pPr>
-        <w:tabs>
-          <w:tab w:val="num" w:pos="720"/>
-        </w:tabs>
-        <w:ind w:left="1200" w:hanging="480"/>
+        <w:ind w:left="1440" w:hanging="480"/>
       </w:pPr>
     </w:lvl>
     <w:lvl w:ilvl="2">
@@ -3544,10 +3642,7 @@
       <w:lvlText w:val="•"/>
       <w:lvlJc w:val="left"/>
       <w:pPr>
-        <w:tabs>
-          <w:tab w:val="num" w:pos="1440"/>
-        </w:tabs>
-        <w:ind w:left="1920" w:hanging="480"/>
+        <w:ind w:left="2160" w:hanging="480"/>
       </w:pPr>
     </w:lvl>
     <w:lvl w:ilvl="3">
@@ -3555,10 +3650,7 @@
       <w:lvlText w:val="–"/>
       <w:lvlJc w:val="left"/>
       <w:pPr>
-        <w:tabs>
-          <w:tab w:val="num" w:pos="2160"/>
-        </w:tabs>
-        <w:ind w:left="2640" w:hanging="480"/>
+        <w:ind w:left="2880" w:hanging="480"/>
       </w:pPr>
     </w:lvl>
     <w:lvl w:ilvl="4">
@@ -3566,10 +3658,7 @@
       <w:lvlText w:val="•"/>
       <w:lvlJc w:val="left"/>
       <w:pPr>
-        <w:tabs>
-          <w:tab w:val="num" w:pos="2880"/>
-        </w:tabs>
-        <w:ind w:left="3360" w:hanging="480"/>
+        <w:ind w:left="3600" w:hanging="480"/>
       </w:pPr>
     </w:lvl>
     <w:lvl w:ilvl="5">
@@ -3577,10 +3666,7 @@
       <w:lvlText w:val="–"/>
       <w:lvlJc w:val="left"/>
       <w:pPr>
-        <w:tabs>
-          <w:tab w:val="num" w:pos="3600"/>
-        </w:tabs>
-        <w:ind w:left="4080" w:hanging="480"/>
+        <w:ind w:left="4320" w:hanging="480"/>
       </w:pPr>
     </w:lvl>
     <w:lvl w:ilvl="6">
@@ -3588,10 +3674,7 @@
       <w:lvlText w:val="•"/>
       <w:lvlJc w:val="left"/>
       <w:pPr>
-        <w:tabs>
-          <w:tab w:val="num" w:pos="4320"/>
-        </w:tabs>
-        <w:ind w:left="4800" w:hanging="480"/>
+        <w:ind w:left="5040" w:hanging="480"/>
       </w:pPr>
     </w:lvl>
     <w:lvl w:ilvl="7">
@@ -3599,10 +3682,7 @@
       <w:lvlText w:val="–"/>
       <w:lvlJc w:val="left"/>
       <w:pPr>
-        <w:tabs>
-          <w:tab w:val="num" w:pos="5040"/>
-        </w:tabs>
-        <w:ind w:left="5520" w:hanging="480"/>
+        <w:ind w:left="5760" w:hanging="480"/>
       </w:pPr>
     </w:lvl>
     <w:lvl w:ilvl="8">
@@ -3610,15 +3690,12 @@
       <w:lvlText w:val="•"/>
       <w:lvlJc w:val="left"/>
       <w:pPr>
-        <w:tabs>
-          <w:tab w:val="num" w:pos="5760"/>
-        </w:tabs>
-        <w:ind w:left="6240" w:hanging="480"/>
+        <w:ind w:left="6480" w:hanging="480"/>
       </w:pPr>
     </w:lvl>
   </w:abstractNum>
   <w:abstractNum w:abstractNumId="99414">
-    <w:nsid w:val="47261bad"/>
+    <w:nsid w:val="A99414"/>
     <w:multiLevelType w:val="multilevel"/>
     <w:lvl w:ilvl="0">
       <w:start w:val="4"/>
@@ -3626,10 +3703,7 @@
       <w:lvlText w:val="%1."/>
       <w:lvlJc w:val="left"/>
       <w:pPr>
-        <w:tabs>
-          <w:tab w:val="num" w:pos="0"/>
-        </w:tabs>
-        <w:ind w:left="480" w:hanging="480"/>
+        <w:ind w:left="720" w:hanging="480"/>
       </w:pPr>
     </w:lvl>
     <w:lvl w:ilvl="1">
@@ -3638,10 +3712,7 @@
       <w:lvlText w:val="%2."/>
       <w:lvlJc w:val="left"/>
       <w:pPr>
-        <w:tabs>
-          <w:tab w:val="num" w:pos="720"/>
-        </w:tabs>
-        <w:ind w:left="1200" w:hanging="480"/>
+        <w:ind w:left="1440" w:hanging="480"/>
       </w:pPr>
     </w:lvl>
     <w:lvl w:ilvl="2">
@@ -3650,10 +3721,7 @@
       <w:lvlText w:val="%3."/>
       <w:lvlJc w:val="left"/>
       <w:pPr>
-        <w:tabs>
-          <w:tab w:val="num" w:pos="1440"/>
-        </w:tabs>
-        <w:ind w:left="1920" w:hanging="480"/>
+        <w:ind w:left="2160" w:hanging="480"/>
       </w:pPr>
     </w:lvl>
     <w:lvl w:ilvl="3">
@@ -3662,10 +3730,7 @@
       <w:lvlText w:val="%4."/>
       <w:lvlJc w:val="left"/>
       <w:pPr>
-        <w:tabs>
-          <w:tab w:val="num" w:pos="2160"/>
-        </w:tabs>
-        <w:ind w:left="2640" w:hanging="480"/>
+        <w:ind w:left="2880" w:hanging="480"/>
       </w:pPr>
     </w:lvl>
     <w:lvl w:ilvl="4">
@@ -3674,10 +3739,7 @@
       <w:lvlText w:val="%5."/>
       <w:lvlJc w:val="left"/>
       <w:pPr>
-        <w:tabs>
-          <w:tab w:val="num" w:pos="2880"/>
-        </w:tabs>
-        <w:ind w:left="3360" w:hanging="480"/>
+        <w:ind w:left="3600" w:hanging="480"/>
       </w:pPr>
     </w:lvl>
     <w:lvl w:ilvl="5">
@@ -3686,10 +3748,7 @@
       <w:lvlText w:val="%6."/>
       <w:lvlJc w:val="left"/>
       <w:pPr>
-        <w:tabs>
-          <w:tab w:val="num" w:pos="3600"/>
-        </w:tabs>
-        <w:ind w:left="4080" w:hanging="480"/>
+        <w:ind w:left="4320" w:hanging="480"/>
       </w:pPr>
     </w:lvl>
     <w:lvl w:ilvl="6">
@@ -3698,10 +3757,7 @@
       <w:lvlText w:val="%7."/>
       <w:lvlJc w:val="left"/>
       <w:pPr>
-        <w:tabs>
-          <w:tab w:val="num" w:pos="4320"/>
-        </w:tabs>
-        <w:ind w:left="4800" w:hanging="480"/>
+        <w:ind w:left="5040" w:hanging="480"/>
       </w:pPr>
     </w:lvl>
     <w:lvl w:ilvl="7">
@@ -3710,10 +3766,7 @@
       <w:lvlText w:val="%8."/>
       <w:lvlJc w:val="left"/>
       <w:pPr>
-        <w:tabs>
-          <w:tab w:val="num" w:pos="5040"/>
-        </w:tabs>
-        <w:ind w:left="5520" w:hanging="480"/>
+        <w:ind w:left="5760" w:hanging="480"/>
       </w:pPr>
     </w:lvl>
     <w:lvl w:ilvl="8">
@@ -3722,15 +3775,12 @@
       <w:lvlText w:val="%9."/>
       <w:lvlJc w:val="left"/>
       <w:pPr>
-        <w:tabs>
-          <w:tab w:val="num" w:pos="5760"/>
-        </w:tabs>
-        <w:ind w:left="6240" w:hanging="480"/>
+        <w:ind w:left="6480" w:hanging="480"/>
       </w:pPr>
     </w:lvl>
   </w:abstractNum>
   <w:abstractNum w:abstractNumId="99415">
-    <w:nsid w:val="b3cbbdee"/>
+    <w:nsid w:val="A99415"/>
     <w:multiLevelType w:val="multilevel"/>
     <w:lvl w:ilvl="0">
       <w:start w:val="5"/>
@@ -3738,10 +3788,7 @@
       <w:lvlText w:val="%1."/>
       <w:lvlJc w:val="left"/>
       <w:pPr>
-        <w:tabs>
-          <w:tab w:val="num" w:pos="0"/>
-        </w:tabs>
-        <w:ind w:left="480" w:hanging="480"/>
+        <w:ind w:left="720" w:hanging="480"/>
       </w:pPr>
     </w:lvl>
     <w:lvl w:ilvl="1">
@@ -3750,10 +3797,7 @@
       <w:lvlText w:val="%2."/>
       <w:lvlJc w:val="left"/>
       <w:pPr>
-        <w:tabs>
-          <w:tab w:val="num" w:pos="720"/>
-        </w:tabs>
-        <w:ind w:left="1200" w:hanging="480"/>
+        <w:ind w:left="1440" w:hanging="480"/>
       </w:pPr>
     </w:lvl>
     <w:lvl w:ilvl="2">
@@ -3762,10 +3806,7 @@
       <w:lvlText w:val="%3."/>
       <w:lvlJc w:val="left"/>
       <w:pPr>
-        <w:tabs>
-          <w:tab w:val="num" w:pos="1440"/>
-        </w:tabs>
-        <w:ind w:left="1920" w:hanging="480"/>
+        <w:ind w:left="2160" w:hanging="480"/>
       </w:pPr>
     </w:lvl>
     <w:lvl w:ilvl="3">
@@ -3774,10 +3815,7 @@
       <w:lvlText w:val="%4."/>
       <w:lvlJc w:val="left"/>
       <w:pPr>
-        <w:tabs>
-          <w:tab w:val="num" w:pos="2160"/>
-        </w:tabs>
-        <w:ind w:left="2640" w:hanging="480"/>
+        <w:ind w:left="2880" w:hanging="480"/>
       </w:pPr>
     </w:lvl>
     <w:lvl w:ilvl="4">
@@ -3786,10 +3824,7 @@
       <w:lvlText w:val="%5."/>
       <w:lvlJc w:val="left"/>
       <w:pPr>
-        <w:tabs>
-          <w:tab w:val="num" w:pos="2880"/>
-        </w:tabs>
-        <w:ind w:left="3360" w:hanging="480"/>
+        <w:ind w:left="3600" w:hanging="480"/>
       </w:pPr>
     </w:lvl>
     <w:lvl w:ilvl="5">
@@ -3798,10 +3833,7 @@
       <w:lvlText w:val="%6."/>
       <w:lvlJc w:val="left"/>
       <w:pPr>
-        <w:tabs>
-          <w:tab w:val="num" w:pos="3600"/>
-        </w:tabs>
-        <w:ind w:left="4080" w:hanging="480"/>
+        <w:ind w:left="4320" w:hanging="480"/>
       </w:pPr>
     </w:lvl>
     <w:lvl w:ilvl="6">
@@ -3810,10 +3842,7 @@
       <w:lvlText w:val="%7."/>
       <w:lvlJc w:val="left"/>
       <w:pPr>
-        <w:tabs>
-          <w:tab w:val="num" w:pos="4320"/>
-        </w:tabs>
-        <w:ind w:left="4800" w:hanging="480"/>
+        <w:ind w:left="5040" w:hanging="480"/>
       </w:pPr>
     </w:lvl>
     <w:lvl w:ilvl="7">
@@ -3822,10 +3851,7 @@
       <w:lvlText w:val="%8."/>
       <w:lvlJc w:val="left"/>
       <w:pPr>
-        <w:tabs>
-          <w:tab w:val="num" w:pos="5040"/>
-        </w:tabs>
-        <w:ind w:left="5520" w:hanging="480"/>
+        <w:ind w:left="5760" w:hanging="480"/>
       </w:pPr>
     </w:lvl>
     <w:lvl w:ilvl="8">
@@ -3834,15 +3860,12 @@
       <w:lvlText w:val="%9."/>
       <w:lvlJc w:val="left"/>
       <w:pPr>
-        <w:tabs>
-          <w:tab w:val="num" w:pos="5760"/>
-        </w:tabs>
-        <w:ind w:left="6240" w:hanging="480"/>
+        <w:ind w:left="6480" w:hanging="480"/>
       </w:pPr>
     </w:lvl>
   </w:abstractNum>
   <w:abstractNum w:abstractNumId="99417">
-    <w:nsid w:val="4fbe019a"/>
+    <w:nsid w:val="A99417"/>
     <w:multiLevelType w:val="multilevel"/>
     <w:lvl w:ilvl="0">
       <w:start w:val="7"/>
@@ -3850,10 +3873,7 @@
       <w:lvlText w:val="%1."/>
       <w:lvlJc w:val="left"/>
       <w:pPr>
-        <w:tabs>
-          <w:tab w:val="num" w:pos="0"/>
-        </w:tabs>
-        <w:ind w:left="480" w:hanging="480"/>
+        <w:ind w:left="720" w:hanging="480"/>
       </w:pPr>
     </w:lvl>
     <w:lvl w:ilvl="1">
@@ -3862,10 +3882,7 @@
       <w:lvlText w:val="%2."/>
       <w:lvlJc w:val="left"/>
       <w:pPr>
-        <w:tabs>
-          <w:tab w:val="num" w:pos="720"/>
-        </w:tabs>
-        <w:ind w:left="1200" w:hanging="480"/>
+        <w:ind w:left="1440" w:hanging="480"/>
       </w:pPr>
     </w:lvl>
     <w:lvl w:ilvl="2">
@@ -3874,10 +3891,7 @@
       <w:lvlText w:val="%3."/>
       <w:lvlJc w:val="left"/>
       <w:pPr>
-        <w:tabs>
-          <w:tab w:val="num" w:pos="1440"/>
-        </w:tabs>
-        <w:ind w:left="1920" w:hanging="480"/>
+        <w:ind w:left="2160" w:hanging="480"/>
       </w:pPr>
     </w:lvl>
     <w:lvl w:ilvl="3">
@@ -3886,10 +3900,7 @@
       <w:lvlText w:val="%4."/>
       <w:lvlJc w:val="left"/>
       <w:pPr>
-        <w:tabs>
-          <w:tab w:val="num" w:pos="2160"/>
-        </w:tabs>
-        <w:ind w:left="2640" w:hanging="480"/>
+        <w:ind w:left="2880" w:hanging="480"/>
       </w:pPr>
     </w:lvl>
     <w:lvl w:ilvl="4">
@@ -3898,10 +3909,7 @@
       <w:lvlText w:val="%5."/>
       <w:lvlJc w:val="left"/>
       <w:pPr>
-        <w:tabs>
-          <w:tab w:val="num" w:pos="2880"/>
-        </w:tabs>
-        <w:ind w:left="3360" w:hanging="480"/>
+        <w:ind w:left="3600" w:hanging="480"/>
       </w:pPr>
     </w:lvl>
     <w:lvl w:ilvl="5">
@@ -3910,10 +3918,7 @@
       <w:lvlText w:val="%6."/>
       <w:lvlJc w:val="left"/>
       <w:pPr>
-        <w:tabs>
-          <w:tab w:val="num" w:pos="3600"/>
-        </w:tabs>
-        <w:ind w:left="4080" w:hanging="480"/>
+        <w:ind w:left="4320" w:hanging="480"/>
       </w:pPr>
     </w:lvl>
     <w:lvl w:ilvl="6">
@@ -3922,10 +3927,7 @@
       <w:lvlText w:val="%7."/>
       <w:lvlJc w:val="left"/>
       <w:pPr>
-        <w:tabs>
-          <w:tab w:val="num" w:pos="4320"/>
-        </w:tabs>
-        <w:ind w:left="4800" w:hanging="480"/>
+        <w:ind w:left="5040" w:hanging="480"/>
       </w:pPr>
     </w:lvl>
     <w:lvl w:ilvl="7">
@@ -3934,10 +3936,7 @@
       <w:lvlText w:val="%8."/>
       <w:lvlJc w:val="left"/>
       <w:pPr>
-        <w:tabs>
-          <w:tab w:val="num" w:pos="5040"/>
-        </w:tabs>
-        <w:ind w:left="5520" w:hanging="480"/>
+        <w:ind w:left="5760" w:hanging="480"/>
       </w:pPr>
     </w:lvl>
     <w:lvl w:ilvl="8">
@@ -3946,10 +3945,7 @@
       <w:lvlText w:val="%9."/>
       <w:lvlJc w:val="left"/>
       <w:pPr>
-        <w:tabs>
-          <w:tab w:val="num" w:pos="5760"/>
-        </w:tabs>
-        <w:ind w:left="6240" w:hanging="480"/>
+        <w:ind w:left="6480" w:hanging="480"/>
       </w:pPr>
     </w:lvl>
   </w:abstractNum>
@@ -4243,10 +4239,10 @@
   <w:docDefaults>
     <w:rPrDefault>
       <w:rPr>
-        <w:rFonts w:asciiTheme="minorHAnsi" w:eastAsiaTheme="minorHAnsi" w:hAnsiTheme="minorHAnsi" w:cstheme="minorBidi"/>
+        <w:rFonts w:asciiTheme="minorHAnsi" w:cstheme="minorBidi" w:eastAsiaTheme="minorHAnsi" w:hAnsiTheme="minorHAnsi"/>
         <w:sz w:val="24"/>
         <w:szCs w:val="24"/>
-        <w:lang w:val="en-US" w:eastAsia="en-US" w:bidi="ar-SA"/>
+        <w:lang w:bidi="ar-SA" w:eastAsia="en-US" w:val="en-US"/>
       </w:rPr>
     </w:rPrDefault>
     <w:pPrDefault>
@@ -4255,35 +4251,35 @@
       </w:pPr>
     </w:pPrDefault>
   </w:docDefaults>
-  <w:latentStyles w:defLockedState="0" w:defUIPriority="0" w:defSemiHidden="0" w:defUnhideWhenUsed="0" w:defQFormat="0" w:count="276"/>
-  <w:style w:type="paragraph" w:default="1" w:styleId="Normal">
+  <w:latentStyles w:count="276" w:defLockedState="0" w:defQFormat="0" w:defSemiHidden="0" w:defUIPriority="0" w:defUnhideWhenUsed="0"/>
+  <w:style w:default="1" w:styleId="Normal" w:type="paragraph">
     <w:name w:val="Normal"/>
     <w:qFormat/>
   </w:style>
-  <w:style w:type="paragraph" w:styleId="BodyText">
+  <w:style w:styleId="BodyText" w:type="paragraph">
     <w:name w:val="Body Text"/>
     <w:basedOn w:val="Normal"/>
     <w:link w:val="BodyTextChar"/>
     <w:pPr>
-      <w:spacing w:before="180" w:after="180"/>
+      <w:spacing w:after="180" w:before="180"/>
     </w:pPr>
     <w:qFormat/>
   </w:style>
-  <w:style w:type="paragraph" w:customStyle="1" w:styleId="FirstParagraph">
+  <w:style w:customStyle="1" w:styleId="FirstParagraph" w:type="paragraph">
     <w:name w:val="First Paragraph"/>
     <w:basedOn w:val="BodyText"/>
     <w:next w:val="BodyText"/>
     <w:qFormat/>
   </w:style>
-  <w:style w:type="paragraph" w:customStyle="1" w:styleId="Compact">
+  <w:style w:customStyle="1" w:styleId="Compact" w:type="paragraph">
     <w:name w:val="Compact"/>
     <w:basedOn w:val="BodyText"/>
     <w:qFormat/>
     <w:pPr>
-      <w:spacing w:before="36" w:after="36"/>
+      <w:spacing w:after="36" w:before="36"/>
     </w:pPr>
   </w:style>
-  <w:style w:type="paragraph" w:styleId="Title">
+  <w:style w:styleId="Title" w:type="paragraph">
     <w:name w:val="Title"/>
     <w:basedOn w:val="Normal"/>
     <w:next w:val="BodyText"/>
@@ -4291,19 +4287,19 @@
     <w:pPr>
       <w:keepNext/>
       <w:keepLines/>
-      <w:spacing w:before="480" w:after="240"/>
+      <w:spacing w:after="240" w:before="480"/>
       <w:jc w:val="center"/>
     </w:pPr>
     <w:rPr>
-      <w:rFonts w:asciiTheme="majorHAnsi" w:eastAsiaTheme="majorEastAsia" w:hAnsiTheme="majorHAnsi" w:cstheme="majorBidi"/>
+      <w:rFonts w:asciiTheme="majorHAnsi" w:cstheme="majorBidi" w:eastAsiaTheme="majorEastAsia" w:hAnsiTheme="majorHAnsi"/>
       <w:b/>
       <w:bCs/>
-      <w:color w:val="345A8A" w:themeColor="accent1" w:themeShade="B5"/>
+      <w:color w:themeColor="accent1" w:themeShade="B5" w:val="345A8A"/>
       <w:sz w:val="36"/>
       <w:szCs w:val="36"/>
     </w:rPr>
   </w:style>
-  <w:style w:type="paragraph" w:styleId="Subtitle">
+  <w:style w:styleId="Subtitle" w:type="paragraph">
     <w:name w:val="Subtitle"/>
     <w:basedOn w:val="Title"/>
     <w:next w:val="BodyText"/>
@@ -4311,7 +4307,7 @@
     <w:pPr>
       <w:keepNext/>
       <w:keepLines/>
-      <w:spacing w:before="240" w:after="240"/>
+      <w:spacing w:after="240" w:before="240"/>
       <w:jc w:val="center"/>
     </w:pPr>
     <w:rPr>
@@ -4319,7 +4315,7 @@
       <w:szCs w:val="30"/>
     </w:rPr>
   </w:style>
-  <w:style w:type="paragraph" w:customStyle="1" w:styleId="Author">
+  <w:style w:customStyle="1" w:styleId="Author" w:type="paragraph">
     <w:name w:val="Author"/>
     <w:next w:val="BodyText"/>
     <w:qFormat/>
@@ -4329,7 +4325,7 @@
       <w:jc w:val="center"/>
     </w:pPr>
   </w:style>
-  <w:style w:type="paragraph" w:styleId="Date">
+  <w:style w:styleId="Date" w:type="paragraph">
     <w:name w:val="Date"/>
     <w:next w:val="BodyText"/>
     <w:qFormat/>
@@ -4339,7 +4335,26 @@
       <w:jc w:val="center"/>
     </w:pPr>
   </w:style>
-  <w:style w:type="paragraph" w:customStyle="1" w:styleId="Abstract">
+  <w:style w:customStyle="1" w:styleId="AbstractTitle" w:type="paragraph">
+    <w:name w:val="Abstract Title"/>
+    <w:basedOn w:val="Normal"/>
+    <w:next w:val="Abstract"/>
+    <w:qFormat/>
+    <w:pPr>
+      <w:keepNext/>
+      <w:keepLines/>
+      <w:jc w:val="center"/>
+      <w:spacing w:after="0" w:before="300"/>
+    </w:pPr>
+    <w:rPr>
+      <w:sz w:val="20"/>
+      <w:szCs w:val="20"/>
+      <w:b/>
+      <w:color w:val="345A8A"/>
+      &gt;
+    </w:rPr>
+  </w:style>
+  <w:style w:customStyle="1" w:styleId="Abstract" w:type="paragraph">
     <w:name w:val="Abstract"/>
     <w:basedOn w:val="Normal"/>
     <w:next w:val="BodyText"/>
@@ -4347,14 +4362,14 @@
     <w:pPr>
       <w:keepNext/>
       <w:keepLines/>
-      <w:spacing w:before="300" w:after="300"/>
+      <w:spacing w:after="300" w:before="100"/>
     </w:pPr>
     <w:rPr>
       <w:sz w:val="20"/>
       <w:szCs w:val="20"/>
     </w:rPr>
   </w:style>
-  <w:style w:type="paragraph" w:styleId="Bibliography">
+  <w:style w:styleId="Bibliography" w:type="paragraph">
     <w:name w:val="Bibliography"/>
     <w:basedOn w:val="Normal"/>
     <w:next w:val="Bibliography"/>
@@ -4362,7 +4377,7 @@
     <w:pPr/>
     <w:rPr/>
   </w:style>
-  <w:style w:type="paragraph" w:styleId="Heading1">
+  <w:style w:styleId="Heading1" w:type="paragraph">
     <w:name w:val="Heading 1"/>
     <w:basedOn w:val="Normal"/>
     <w:next w:val="BodyText"/>
@@ -4371,19 +4386,19 @@
     <w:pPr>
       <w:keepNext/>
       <w:keepLines/>
-      <w:spacing w:before="480" w:after="0"/>
+      <w:spacing w:after="0" w:before="480"/>
       <w:outlineLvl w:val="0"/>
     </w:pPr>
     <w:rPr>
-      <w:rFonts w:asciiTheme="majorHAnsi" w:eastAsiaTheme="majorEastAsia" w:hAnsiTheme="majorHAnsi" w:cstheme="majorBidi"/>
+      <w:rFonts w:asciiTheme="majorHAnsi" w:cstheme="majorBidi" w:eastAsiaTheme="majorEastAsia" w:hAnsiTheme="majorHAnsi"/>
       <w:b/>
       <w:bCs/>
-      <w:color w:val="4F81BD" w:themeColor="accent1"/>
+      <w:color w:themeColor="accent1" w:val="4F81BD"/>
       <w:sz w:val="32"/>
       <w:szCs w:val="32"/>
     </w:rPr>
   </w:style>
-  <w:style w:type="paragraph" w:styleId="Heading2">
+  <w:style w:styleId="Heading2" w:type="paragraph">
     <w:name w:val="Heading 2"/>
     <w:basedOn w:val="Normal"/>
     <w:next w:val="BodyText"/>
@@ -4393,19 +4408,19 @@
     <w:pPr>
       <w:keepNext/>
       <w:keepLines/>
-      <w:spacing w:before="200" w:after="0"/>
+      <w:spacing w:after="0" w:before="200"/>
       <w:outlineLvl w:val="1"/>
     </w:pPr>
     <w:rPr>
-      <w:rFonts w:asciiTheme="majorHAnsi" w:eastAsiaTheme="majorEastAsia" w:hAnsiTheme="majorHAnsi" w:cstheme="majorBidi"/>
+      <w:rFonts w:asciiTheme="majorHAnsi" w:cstheme="majorBidi" w:eastAsiaTheme="majorEastAsia" w:hAnsiTheme="majorHAnsi"/>
       <w:b/>
       <w:bCs/>
-      <w:color w:val="4F81BD" w:themeColor="accent1"/>
+      <w:color w:themeColor="accent1" w:val="4F81BD"/>
       <w:sz w:val="28"/>
       <w:szCs w:val="28"/>
     </w:rPr>
   </w:style>
-  <w:style w:type="paragraph" w:styleId="Heading3">
+  <w:style w:styleId="Heading3" w:type="paragraph">
     <w:name w:val="Heading 3"/>
     <w:basedOn w:val="Normal"/>
     <w:next w:val="BodyText"/>
@@ -4415,19 +4430,19 @@
     <w:pPr>
       <w:keepNext/>
       <w:keepLines/>
-      <w:spacing w:before="200" w:after="0"/>
+      <w:spacing w:after="0" w:before="200"/>
       <w:outlineLvl w:val="2"/>
     </w:pPr>
     <w:rPr>
-      <w:rFonts w:asciiTheme="majorHAnsi" w:eastAsiaTheme="majorEastAsia" w:hAnsiTheme="majorHAnsi" w:cstheme="majorBidi"/>
+      <w:rFonts w:asciiTheme="majorHAnsi" w:cstheme="majorBidi" w:eastAsiaTheme="majorEastAsia" w:hAnsiTheme="majorHAnsi"/>
       <w:b/>
       <w:bCs/>
-      <w:color w:val="4F81BD" w:themeColor="accent1"/>
+      <w:color w:themeColor="accent1" w:val="4F81BD"/>
       <w:sz w:val="24"/>
       <w:szCs w:val="24"/>
     </w:rPr>
   </w:style>
-  <w:style w:type="paragraph" w:styleId="Heading4">
+  <w:style w:styleId="Heading4" w:type="paragraph">
     <w:name w:val="Heading 4"/>
     <w:basedOn w:val="Normal"/>
     <w:next w:val="BodyText"/>
@@ -4437,19 +4452,19 @@
     <w:pPr>
       <w:keepNext/>
       <w:keepLines/>
-      <w:spacing w:before="200" w:after="0"/>
+      <w:spacing w:after="0" w:before="200"/>
       <w:outlineLvl w:val="3"/>
     </w:pPr>
     <w:rPr>
-      <w:rFonts w:asciiTheme="majorHAnsi" w:eastAsiaTheme="majorEastAsia" w:hAnsiTheme="majorHAnsi" w:cstheme="majorBidi"/>
+      <w:rFonts w:asciiTheme="majorHAnsi" w:cstheme="majorBidi" w:eastAsiaTheme="majorEastAsia" w:hAnsiTheme="majorHAnsi"/>
       <w:i/>
       <w:bCs/>
-      <w:color w:val="4F81BD" w:themeColor="accent1"/>
+      <w:color w:themeColor="accent1" w:val="4F81BD"/>
       <w:sz w:val="24"/>
       <w:szCs w:val="24"/>
     </w:rPr>
   </w:style>
-  <w:style w:type="paragraph" w:styleId="Heading5">
+  <w:style w:styleId="Heading5" w:type="paragraph">
     <w:name w:val="Heading 5"/>
     <w:basedOn w:val="Normal"/>
     <w:next w:val="BodyText"/>
@@ -4459,18 +4474,18 @@
     <w:pPr>
       <w:keepNext/>
       <w:keepLines/>
-      <w:spacing w:before="200" w:after="0"/>
+      <w:spacing w:after="0" w:before="200"/>
       <w:outlineLvl w:val="4"/>
     </w:pPr>
     <w:rPr>
-      <w:rFonts w:asciiTheme="majorHAnsi" w:eastAsiaTheme="majorEastAsia" w:hAnsiTheme="majorHAnsi" w:cstheme="majorBidi"/>
+      <w:rFonts w:asciiTheme="majorHAnsi" w:cstheme="majorBidi" w:eastAsiaTheme="majorEastAsia" w:hAnsiTheme="majorHAnsi"/>
       <w:iCs/>
-      <w:color w:val="4F81BD" w:themeColor="accent1"/>
+      <w:color w:themeColor="accent1" w:val="4F81BD"/>
       <w:sz w:val="24"/>
       <w:szCs w:val="24"/>
     </w:rPr>
   </w:style>
-  <w:style w:type="paragraph" w:styleId="Heading6">
+  <w:style w:styleId="Heading6" w:type="paragraph">
     <w:name w:val="Heading 6"/>
     <w:basedOn w:val="Normal"/>
     <w:next w:val="BodyText"/>
@@ -4480,17 +4495,17 @@
     <w:pPr>
       <w:keepNext/>
       <w:keepLines/>
-      <w:spacing w:before="200" w:after="0"/>
+      <w:spacing w:after="0" w:before="200"/>
       <w:outlineLvl w:val="5"/>
     </w:pPr>
     <w:rPr>
-      <w:rFonts w:asciiTheme="majorHAnsi" w:eastAsiaTheme="majorEastAsia" w:hAnsiTheme="majorHAnsi" w:cstheme="majorBidi"/>
-      <w:color w:val="4F81BD" w:themeColor="accent1"/>
+      <w:rFonts w:asciiTheme="majorHAnsi" w:cstheme="majorBidi" w:eastAsiaTheme="majorEastAsia" w:hAnsiTheme="majorHAnsi"/>
+      <w:color w:themeColor="accent1" w:val="4F81BD"/>
       <w:sz w:val="24"/>
       <w:szCs w:val="24"/>
     </w:rPr>
   </w:style>
-  <w:style w:type="paragraph" w:styleId="Heading7">
+  <w:style w:styleId="Heading7" w:type="paragraph">
     <w:name w:val="Heading 7"/>
     <w:basedOn w:val="Normal"/>
     <w:next w:val="BodyText"/>
@@ -4500,17 +4515,17 @@
     <w:pPr>
       <w:keepNext/>
       <w:keepLines/>
-      <w:spacing w:before="200" w:after="0"/>
+      <w:spacing w:after="0" w:before="200"/>
       <w:outlineLvl w:val="6"/>
     </w:pPr>
     <w:rPr>
-      <w:rFonts w:asciiTheme="majorHAnsi" w:eastAsiaTheme="majorEastAsia" w:hAnsiTheme="majorHAnsi" w:cstheme="majorBidi"/>
-      <w:color w:val="4F81BD" w:themeColor="accent1"/>
+      <w:rFonts w:asciiTheme="majorHAnsi" w:cstheme="majorBidi" w:eastAsiaTheme="majorEastAsia" w:hAnsiTheme="majorHAnsi"/>
+      <w:color w:themeColor="accent1" w:val="4F81BD"/>
       <w:sz w:val="24"/>
       <w:szCs w:val="24"/>
     </w:rPr>
   </w:style>
-  <w:style w:type="paragraph" w:styleId="Heading8">
+  <w:style w:styleId="Heading8" w:type="paragraph">
     <w:name w:val="Heading 8"/>
     <w:basedOn w:val="Normal"/>
     <w:next w:val="BodyText"/>
@@ -4520,17 +4535,17 @@
     <w:pPr>
       <w:keepNext/>
       <w:keepLines/>
-      <w:spacing w:before="200" w:after="0"/>
+      <w:spacing w:after="0" w:before="200"/>
       <w:outlineLvl w:val="7"/>
     </w:pPr>
     <w:rPr>
-      <w:rFonts w:asciiTheme="majorHAnsi" w:eastAsiaTheme="majorEastAsia" w:hAnsiTheme="majorHAnsi" w:cstheme="majorBidi"/>
-      <w:color w:val="4F81BD" w:themeColor="accent1"/>
+      <w:rFonts w:asciiTheme="majorHAnsi" w:cstheme="majorBidi" w:eastAsiaTheme="majorEastAsia" w:hAnsiTheme="majorHAnsi"/>
+      <w:color w:themeColor="accent1" w:val="4F81BD"/>
       <w:sz w:val="24"/>
       <w:szCs w:val="24"/>
     </w:rPr>
   </w:style>
-  <w:style w:type="paragraph" w:styleId="Heading9">
+  <w:style w:styleId="Heading9" w:type="paragraph">
     <w:name w:val="Heading 9"/>
     <w:basedOn w:val="Normal"/>
     <w:next w:val="BodyText"/>
@@ -4540,17 +4555,17 @@
     <w:pPr>
       <w:keepNext/>
       <w:keepLines/>
-      <w:spacing w:before="200" w:after="0"/>
+      <w:spacing w:after="0" w:before="200"/>
       <w:outlineLvl w:val="8"/>
     </w:pPr>
     <w:rPr>
-      <w:rFonts w:asciiTheme="majorHAnsi" w:eastAsiaTheme="majorEastAsia" w:hAnsiTheme="majorHAnsi" w:cstheme="majorBidi"/>
-      <w:color w:val="4F81BD" w:themeColor="accent1"/>
+      <w:rFonts w:asciiTheme="majorHAnsi" w:cstheme="majorBidi" w:eastAsiaTheme="majorEastAsia" w:hAnsiTheme="majorHAnsi"/>
+      <w:color w:themeColor="accent1" w:val="4F81BD"/>
       <w:sz w:val="24"/>
       <w:szCs w:val="24"/>
     </w:rPr>
   </w:style>
-  <w:style w:type="paragraph" w:styleId="BlockText">
+  <w:style w:styleId="BlockText" w:type="paragraph">
     <w:name w:val="Block Text"/>
     <w:basedOn w:val="BodyText"/>
     <w:next w:val="BodyText"/>
@@ -4558,11 +4573,11 @@
     <w:unhideWhenUsed/>
     <w:qFormat/>
     <w:pPr>
-      <w:spacing w:before="100" w:after="100"/>
+      <w:spacing w:after="100" w:before="100"/>
       <w:ind w:firstLine="0" w:left="480" w:right="480"/>
     </w:pPr>
   </w:style>
-  <w:style w:type="paragraph" w:styleId="FootnoteText">
+  <w:style w:styleId="FootnoteText" w:type="paragraph">
     <w:name w:val="Footnote Text"/>
     <w:basedOn w:val="Normal"/>
     <w:next w:val="FootnoteText"/>
@@ -4570,28 +4585,43 @@
     <w:unhideWhenUsed/>
     <w:qFormat/>
   </w:style>
-  <w:style w:type="character" w:default="1" w:styleId="DefaultParagraphFont">
+  <w:style w:default="1" w:styleId="DefaultParagraphFont" w:type="character">
     <w:name w:val="Default Paragraph Font"/>
     <w:semiHidden/>
     <w:unhideWhenUsed/>
   </w:style>
-  <w:style w:type="table" w:default="1" w:styleId="Table">
+  <w:style w:default="1" w:styleId="Table" w:type="table">
     <w:name w:val="Table"/>
     <w:basedOn w:val="TableNormal"/>
     <w:semiHidden/>
     <w:unhideWhenUsed/>
     <w:qFormat/>
     <w:tblPr>
-      <w:tblInd w:w="0" w:type="dxa"/>
+      <w:tblInd w:type="dxa" w:w="0"/>
       <w:tblCellMar>
-        <w:top w:w="0" w:type="dxa"/>
-        <w:left w:w="108" w:type="dxa"/>
-        <w:bottom w:w="0" w:type="dxa"/>
-        <w:right w:w="108" w:type="dxa"/>
+        <w:top w:type="dxa" w:w="0"/>
+        <w:left w:type="dxa" w:w="108"/>
+        <w:bottom w:type="dxa" w:w="0"/>
+        <w:right w:type="dxa" w:w="108"/>
       </w:tblCellMar>
     </w:tblPr>
-  </w:style>
-  <w:style w:type="paragraph" w:customStyle="1" w:styleId="DefinitionTerm">
+    <w:tblStylePr w:type="firstRow">
+      <w:tblPr>
+        <w:jc w:val="left"/>
+        <w:tblInd w:type="dxa" w:w="0"/>
+      </w:tblPr>
+      <w:trPr>
+        <w:jc w:val="left"/>
+      </w:trPr>
+      <w:tcPr>
+        <w:vAlign w:val="bottom"/>
+        <w:tcBorders>
+          <w:bottom w:val="single"/>
+        </w:tcBorders>
+      </w:tcPr>
+    </w:tblStylePr>
+  </w:style>
+  <w:style w:customStyle="1" w:styleId="DefinitionTerm" w:type="paragraph">
     <w:name w:val="Definition Term"/>
     <w:basedOn w:val="Normal"/>
     <w:next w:val="Definition"/>
@@ -4604,49 +4634,49 @@
       <w:b/>
     </w:rPr>
   </w:style>
-  <w:style w:type="paragraph" w:customStyle="1" w:styleId="Definition">
+  <w:style w:customStyle="1" w:styleId="Definition" w:type="paragraph">
     <w:name w:val="Definition"/>
     <w:basedOn w:val="Normal"/>
   </w:style>
-  <w:style w:type="paragraph" w:styleId="Caption">
+  <w:style w:styleId="Caption" w:type="paragraph">
     <w:name w:val="Caption"/>
     <w:basedOn w:val="Normal"/>
     <w:link w:val="BodyTextChar"/>
     <w:pPr>
-      <w:spacing w:before="0" w:after="120"/>
+      <w:spacing w:after="120" w:before="0"/>
     </w:pPr>
     <w:rPr>
       <w:i/>
     </w:rPr>
   </w:style>
-  <w:style w:type="paragraph" w:customStyle="1" w:styleId="TableCaption">
+  <w:style w:customStyle="1" w:styleId="TableCaption" w:type="paragraph">
     <w:name w:val="Table Caption"/>
     <w:basedOn w:val="Caption"/>
     <w:pPr>
       <w:keepNext/>
     </w:pPr>
   </w:style>
-  <w:style w:type="paragraph" w:customStyle="1" w:styleId="ImageCaption">
+  <w:style w:customStyle="1" w:styleId="ImageCaption" w:type="paragraph">
     <w:name w:val="Image Caption"/>
     <w:basedOn w:val="Caption"/>
   </w:style>
-  <w:style w:type="paragraph" w:customStyle="1" w:styleId="Figure">
+  <w:style w:customStyle="1" w:styleId="Figure" w:type="paragraph">
     <w:name w:val="Figure"/>
     <w:basedOn w:val="Normal"/>
   </w:style>
-  <w:style w:type="paragraph" w:customStyle="1" w:styleId="CaptionedFigure">
+  <w:style w:customStyle="1" w:styleId="CaptionedFigure" w:type="paragraph">
     <w:name w:val="Captioned Figure"/>
     <w:basedOn w:val="Figure"/>
     <w:pPr>
       <w:keepNext/>
     </w:pPr>
   </w:style>
-  <w:style w:type="character" w:customStyle="1" w:styleId="BodyTextChar">
+  <w:style w:customStyle="1" w:styleId="BodyTextChar" w:type="character">
     <w:name w:val="Body Text Char"/>
     <w:basedOn w:val="DefaultParagraphFont"/>
     <w:link w:val="BodyText"/>
   </w:style>
-  <w:style w:type="character" w:customStyle="1" w:styleId="VerbatimChar">
+  <w:style w:customStyle="1" w:styleId="VerbatimChar" w:type="character">
     <w:name w:val="Verbatim Char"/>
     <w:basedOn w:val="BodyTextChar"/>
     <w:rPr>
@@ -4654,21 +4684,25 @@
       <w:sz w:val="22"/>
     </w:rPr>
   </w:style>
-  <w:style w:type="character" w:styleId="FootnoteReference">
+  <w:style w:customStyle="1" w:styleId="SectionNumber" w:type="character">
+    <w:name w:val="Section Number"/>
+    <w:basedOn w:val="BodyTextChar"/>
+  </w:style>
+  <w:style w:styleId="FootnoteReference" w:type="character">
     <w:name w:val="Footnote Reference"/>
     <w:basedOn w:val="BodyTextChar"/>
     <w:rPr>
       <w:vertAlign w:val="superscript"/>
     </w:rPr>
   </w:style>
-  <w:style w:type="character" w:styleId="Hyperlink">
+  <w:style w:styleId="Hyperlink" w:type="character">
     <w:name w:val="Hyperlink"/>
     <w:basedOn w:val="BodyTextChar"/>
     <w:rPr>
-      <w:color w:val="4F81BD" w:themeColor="accent1"/>
+      <w:color w:themeColor="accent1" w:val="4F81BD"/>
     </w:rPr>
   </w:style>
-  <w:style w:type="paragraph" w:styleId="TOCHeading">
+  <w:style w:styleId="TOCHeading" w:type="paragraph">
     <w:name w:val="TOC Heading"/>
     <w:basedOn w:val="Heading1"/>
     <w:next w:val="BodyText"/>
@@ -4680,10 +4714,10 @@
       <w:outlineLvl w:val="9"/>
     </w:pPr>
     <w:rPr>
-      <w:rFonts w:asciiTheme="majorHAnsi" w:eastAsiaTheme="majorEastAsia" w:hAnsiTheme="majorHAnsi" w:cstheme="majorBidi"/>
+      <w:rFonts w:asciiTheme="majorHAnsi" w:cstheme="majorBidi" w:eastAsiaTheme="majorEastAsia" w:hAnsiTheme="majorHAnsi"/>
       <w:b w:val="0"/>
       <w:bCs w:val="0"/>
-      <w:color w:val="365F91" w:themeColor="accent1" w:themeShade="BF"/>
+      <w:color w:themeColor="accent1" w:themeShade="BF" w:val="365F91"/>
     </w:rPr>
   </w:style>
   <w:style w:type="paragraph" w:customStyle="1" w:styleId="SourceCode">
@@ -4775,7 +4809,10 @@
   <w:style w:type="character" w:customStyle="1" w:styleId="ImportTok">
     <w:name w:val="ImportTok"/>
     <w:basedOn w:val="VerbatimChar"/>
-    <w:rPr/>
+    <w:rPr>
+      <w:color w:val="008000"/>
+      <w:b/>
+    </w:rPr>
   </w:style>
   <w:style w:type="character" w:customStyle="1" w:styleId="CommentTok">
     <w:name w:val="CommentTok"/>
@@ -4850,7 +4887,9 @@
   <w:style w:type="character" w:customStyle="1" w:styleId="BuiltInTok">
     <w:name w:val="BuiltInTok"/>
     <w:basedOn w:val="VerbatimChar"/>
-    <w:rPr/>
+    <w:rPr>
+      <w:color w:val="008000"/>
+    </w:rPr>
   </w:style>
   <w:style w:type="character" w:customStyle="1" w:styleId="ExtensionTok">
     <w:name w:val="ExtensionTok"/>

</xml_diff>